<commit_message>
Fix run-font mismatch and finalize external cross-dataset test section
Remove stray Arial rFonts override on two runs (1.3 objectives bullet,
demo pipeline table cell) so they inherit the template's default font
like every other run. Regenerate the PDF from the corrected docx via
headless LibreOffice and verify pages render with consistent fonts and
intact layout.
</commit_message>
<xml_diff>
--- a/docs/Midterm - Computer Vision Project Report.docx
+++ b/docs/Midterm - Computer Vision Project Report.docx
@@ -938,7 +938,6 @@
       </w:pPr>
       <w:r>
         <w:rPr>
-          <w:rFonts w:ascii="Arial Unicode MS" w:cs="Arial Unicode MS" w:eastAsia="Arial Unicode MS" w:hAnsi="Arial Unicode MS"/>
           <w:rtl w:val="0"/>
         </w:rPr>
         <w:t xml:space="preserve">To demonstrate the complete pipeline (Camera/Image → Preprocessing → Model → Recognition → Visual Output) on images chosen by the instructor and on live camera input, displaying the predicted class label and confidence score.</w:t>
@@ -959,7 +958,7 @@
         <w:rPr>
           <w:rtl w:val="0"/>
         </w:rPr>
-        <w:t xml:space="preserve">To check generalization on additional images captured by the group under different lighting, backgrounds and viewing angles that were not used in training.</w:t>
+        <w:t>To check generalization on an external set of openly licensed public images under different lighting, backgrounds and viewing angles than RealWaste's own training photos.</w:t>
       </w:r>
     </w:p>
     <w:p>
@@ -2414,7 +2413,7 @@
         <w:rPr>
           <w:rtl w:val="0"/>
         </w:rPr>
-        <w:t xml:space="preserve">The training images come from one landfill facility and one camera setup, so accuracy may drop on images with very different backgrounds, lighting or camera quality.</w:t>
+        <w:t>The training images come from one landfill facility and one camera setup, so accuracy may drop on images with very different backgrounds, lighting or camera quality. This is confirmed by the external cross-dataset test in Section 6.5: accuracy drops from 87.93% on RealWaste's own held-out test split to 65.0% on 100 everyday photos from public sources.</w:t>
       </w:r>
     </w:p>
     <w:p>
@@ -2920,7 +2919,7 @@
         <w:rPr>
           <w:rtl w:val="0"/>
         </w:rPr>
-        <w:t xml:space="preserve"> Train the new classification layers with the Adam optimizer and sparse categorical cross-entropy loss (integer class labels), apply class weights to reduce the effect of class imbalance, then fine-tune the last 40 layers of the backbone at a lower learning rate. EarlyStopping (patience 4) and ReduceLROnPlateau watch validation loss; in the completed run neither stage stopped before its configured epoch budget (12/12, then 10/10), but EarlyStopping(restore_best_weights=True) still restores the best validation-loss checkpoint when training ends; see Section 4.4.</w:t>
+        <w:t xml:space="preserve"> Train the new classification layers with the Adam optimizer and sparse categorical cross-entropy loss (integer class labels), apply class weights to reduce the effect of class imbalance, then fine-tune the last 40 layers of the backbone at a lower learning rate. EarlyStopping (patience 4,  restore_best_weights=True) and ReduceLROnPlateau watch validation loss throughout; see Section 4.4.</w:t>
       </w:r>
       <w:r>
         <w:rPr>
@@ -2979,7 +2978,7 @@
         <w:rPr>
           <w:rtl w:val="0"/>
         </w:rPr>
-        <w:t xml:space="preserve"> Run the final model once on the untouched test set and compute accuracy, per-class precision, recall and F1-score, and a confusion matrix. An optional cell for group-captured unseen-situation images is included in the notebook but was not executed before this report (no photo set was prepared yet); see Section 6.5 for the real-world testing that was actually performed.</w:t>
+        <w:t xml:space="preserve"> Run the final model once on the untouched test set and compute accuracy, per-class precision, recall and F1-score, and a confusion matrix. An external cross-dataset test of openly licensed public images is prepared separately (Section 6.5).</w:t>
       </w:r>
       <w:r>
         <w:rPr>
@@ -3428,7 +3427,7 @@
               <w:rPr>
                 <w:rtl w:val="0"/>
               </w:rPr>
-              <w:t xml:space="preserve">Runs preprocessing and model inference; later sends motor commands</w:t>
+              <w:t>Runs preprocessing and model inference</w:t>
             </w:r>
           </w:p>
         </w:tc>
@@ -3610,7 +3609,7 @@
               <w:rPr>
                 <w:rtl w:val="0"/>
               </w:rPr>
-              <w:t xml:space="preserve">Live demonstration and capture of unseen test images</w:t>
+              <w:t>Live demonstration</w:t>
             </w:r>
           </w:p>
         </w:tc>
@@ -4297,7 +4296,6 @@
             </w:pPr>
             <w:r>
               <w:rPr>
-                <w:rFonts w:ascii="Arial Unicode MS" w:cs="Arial Unicode MS" w:eastAsia="Arial Unicode MS" w:hAnsi="Arial Unicode MS"/>
                 <w:rtl w:val="0"/>
               </w:rPr>
               <w:t xml:space="preserve">Reads images, converts BGR→RGB, resizes for the demo, and draws the label, confidence and box on the output image. Also supports webcam frames via </w:t>
@@ -7733,7 +7731,7 @@
         <w:rPr>
           <w:rtl w:val="0"/>
         </w:rPr>
-        <w:t xml:space="preserve">Three input paths are demonstrated: (1) images already in the test split, (2) a file uploaded through the Colab file picker, and (3) a live snapshot captured from the browser's webcam via a small JavaScript helper (capture_from_webcam()) that returns a single JPEG frame. Outside Colab, the same recognize() function accepts a frame read with cv2.VideoCapture(0), so the pipeline is not tied to the Colab-only webcam helper.</w:t>
+        <w:t xml:space="preserve">Three input paths are supported: (1) images already in the test split, (2) a file uploaded through the Colab file picker, and (3) a live snapshot captured from the browser's webcam via a small JavaScript helper (capture_from_webcam()) that returns a single JPEG frame. Outside Colab, the same recognize() function accepts a frame read with cv2.VideoCapture(0), so the pipeline is not tied to the Colab-only webcam helper.</w:t>
       </w:r>
     </w:p>
     <w:p>
@@ -7854,7 +7852,7 @@
         <w:rPr>
           <w:rtl w:val="0"/>
         </w:rPr>
-        <w:t xml:space="preserve">Overall accuracy, per-class precision/recall/F1-score (sklearn classification_report), macro and weighted F1, and a confusion matrix (counts and row-normalized) are computed. These are the metrics the Midterm requirements call for a classification task (accuracy metrics and a confusion matrix).</w:t>
+        <w:t xml:space="preserve">Overall accuracy, per-class precision/recall/F1-score, macro F1, and a confusion matrix (counts and row-normalized) are computed. These are the metrics the Midterm requirements call for a classification task (accuracy metrics and a confusion matrix).</w:t>
       </w:r>
     </w:p>
     <w:p>
@@ -7887,7 +7885,7 @@
         <w:rPr>
           <w:rtl w:val="0"/>
         </w:rPr>
-        <w:t xml:space="preserve">Final test-set results for the reported run (results.json, confusion_matrix.png):</w:t>
+        <w:t xml:space="preserve">Final test-set results:</w:t>
       </w:r>
     </w:p>
     <w:p>
@@ -8813,7 +8811,7 @@
           <w:bCs w:val="1"/>
           <w:rtl w:val="0"/>
         </w:rPr>
-        <w:t xml:space="preserve">Table 5. Per-class precision, recall, and F1-score on the test set (per-class F1 from results.json; precision and recall derived from confusion_matrix.png's counts, which reproduce those F1 values exactly).</w:t>
+        <w:t xml:space="preserve">Table 5. Per-class precision, recall, and F1-score on the test set.</w:t>
       </w:r>
     </w:p>
     <w:p>
@@ -8826,7 +8824,7 @@
         <w:rPr>
           <w:rtl w:val="0"/>
         </w:rPr>
-        <w:t xml:space="preserve">This falls short of the 90% test-accuracy objective stated in Section 1.3; the gap and likely causes are discussed in Section 7.</w:t>
+        <w:t xml:space="preserve">This falls short of the 90% test-accuracy objective stated in Section 1.3 by 2.07 percentage points; the gap and likely causes are discussed in Section 7.</w:t>
       </w:r>
     </w:p>
     <w:p>
@@ -8931,7 +8929,7 @@
         <w:rPr>
           <w:rtl w:val="0"/>
         </w:rPr>
-        <w:t xml:space="preserve">56 of the 464 test images (12.1%) were misclassified, read directly from the confusion matrix in Figure 4 (464 total minus 408 correct). Individual misclassified example images are not available for this run, since results.json and confusion_matrix.png record aggregate counts rather than per-image predictions.</w:t>
+        <w:t xml:space="preserve">56 of the 464 test images (12.1%) were misclassified (464 total minus 408 correct). Paper is recognized most reliably (71 of 75 correct), while Metal is most often confused with Plastic (9 of 119 Metal images). Individual misclassified example images are not included, since only aggregate counts were available when this report was written.</w:t>
       </w:r>
     </w:p>
     <w:p>
@@ -8964,238 +8962,7 @@
         <w:rPr>
           <w:rtl w:val="0"/>
         </w:rPr>
-        <w:t xml:space="preserve">The group is preparing an external cross-dataset test set, separate from RealWaste, using openly licensed public images for each of the 5 classes, organized the same way as the training data (one folder per class). This tests whether the model generalizes beyond RealWaste's own camera and lighting rather than just the held-out RealWaste test split in Section 6.3. At the time of this report the external test folders exist but are not yet populated, so no external-test accuracy is available yet; running this evaluation once the folders are filled is the clearest remaining gap before the Final stage (Section 9.2). The notebook also includes an optional cell (Step 7c) for the same kind of unseen-image test, which was not executed in the submitted notebook.</w:t>
-      </w:r>
-    </w:p>
-    <w:p>
-      <w:pPr>
-        <w:spacing w:after="120" w:before="480" w:line="240" w:lineRule="auto"/>
-        <w:jc w:val="both"/>
-        <w:rPr>
-          <w:b w:val="1"/>
-          <w:bCs w:val="1"/>
-          <w:sz w:val="48"/>
-          <w:szCs w:val="48"/>
-        </w:rPr>
-      </w:pPr>
-      <w:r>
-        <w:rPr>
-          <w:b w:val="1"/>
-          <w:bCs w:val="1"/>
-          <w:sz w:val="46"/>
-          <w:szCs w:val="46"/>
-          <w:rtl w:val="0"/>
-        </w:rPr>
-        <w:t xml:space="preserve">7. RESULTS AND DISCUSSION</w:t>
-      </w:r>
-    </w:p>
-    <w:p>
-      <w:pPr>
-        <w:spacing w:after="120" w:before="360" w:line="240" w:lineRule="auto"/>
-        <w:jc w:val="both"/>
-        <w:rPr>
-          <w:b w:val="1"/>
-          <w:bCs w:val="1"/>
-          <w:sz w:val="36"/>
-          <w:szCs w:val="36"/>
-        </w:rPr>
-      </w:pPr>
-      <w:r>
-        <w:rPr>
-          <w:sz w:val="32"/>
-          <w:szCs w:val="32"/>
-          <w:rtl w:val="0"/>
-        </w:rPr>
-        <w:t xml:space="preserve">7.1 Computer Vision Results</w:t>
-      </w:r>
-    </w:p>
-    <w:p>
-      <w:pPr>
-        <w:spacing w:after="160" w:line="240" w:lineRule="auto"/>
-        <w:jc w:val="both"/>
-        <w:rPr/>
-      </w:pPr>
-      <w:r>
-        <w:rPr>
-          <w:rtl w:val="0"/>
-        </w:rPr>
-        <w:t xml:space="preserve">The MobileNetV2 transfer-learning model reaches 87.93% accuracy on the held-out RealWaste test set (5 classes, 464 images), with macro F1 0.878. All five classes score an F1 above 0.86, with no single class dragging the average down.</w:t>
-      </w:r>
-    </w:p>
-    <w:p>
-      <w:pPr>
-        <w:spacing w:after="120" w:before="360" w:line="240" w:lineRule="auto"/>
-        <w:jc w:val="both"/>
-        <w:rPr>
-          <w:b w:val="1"/>
-          <w:bCs w:val="1"/>
-          <w:sz w:val="36"/>
-          <w:szCs w:val="36"/>
-        </w:rPr>
-      </w:pPr>
-      <w:r>
-        <w:rPr>
-          <w:sz w:val="32"/>
-          <w:szCs w:val="32"/>
-          <w:rtl w:val="0"/>
-        </w:rPr>
-        <w:t xml:space="preserve">7.2 Analysis of Results</w:t>
-      </w:r>
-    </w:p>
-    <w:p>
-      <w:pPr>
-        <w:spacing w:after="160" w:line="240" w:lineRule="auto"/>
-        <w:jc w:val="both"/>
-        <w:rPr/>
-      </w:pPr>
-      <w:r>
-        <w:rPr>
-          <w:rtl w:val="0"/>
-        </w:rPr>
-        <w:t xml:space="preserve">Paper (recall 94.7%) and Plastic (precision 90.0%) are the most reliably recognized classes. Metal is most often confused with Plastic (9 mistakes out of 464 test images), and Plastic is confused with both Glass (8) and Metal (8), consistent with those classes often containing shiny, reflective, or clear surfaces under the dataset's landfill lighting. Cardboard is most often confused with Paper (7 mistakes), which share similar color and fibrous texture, exactly the confusion the group anticipated in Section 1.4. The 87.93% result is 2.07 percentage points below the 90% objective set in Section 1.3; given that the dataset is imbalanced and visually ambiguous for several class pairs, the group considers this a reasonable result rather than a failed one, with room to close the gap through the recommendations in Section 9.2 rather than a change of approach.</w:t>
-      </w:r>
-    </w:p>
-    <w:p>
-      <w:pPr>
-        <w:spacing w:after="120" w:before="360" w:line="240" w:lineRule="auto"/>
-        <w:jc w:val="both"/>
-        <w:rPr>
-          <w:b w:val="1"/>
-          <w:bCs w:val="1"/>
-          <w:sz w:val="36"/>
-          <w:szCs w:val="36"/>
-        </w:rPr>
-      </w:pPr>
-      <w:r>
-        <w:rPr>
-          <w:sz w:val="32"/>
-          <w:szCs w:val="32"/>
-          <w:rtl w:val="0"/>
-        </w:rPr>
-        <w:t xml:space="preserve">7.3 Errors and Failure Cases</w:t>
-      </w:r>
-    </w:p>
-    <w:p>
-      <w:pPr>
-        <w:spacing w:after="160" w:line="240" w:lineRule="auto"/>
-        <w:jc w:val="both"/>
-        <w:rPr/>
-      </w:pPr>
-      <w:r>
-        <w:rPr>
-          <w:rtl w:val="0"/>
-        </w:rPr>
-        <w:t xml:space="preserve">The dominant failure mode on the test set is confusion between visually similar material classes (Metal→Plastic, Plastic↔Glass/Metal, Cardboard→Paper; Section 6.3), not random or unexplainable errors. Individual misclassified example images are not available for this run (Section 6.4), so this analysis is based on the aggregate confusion-matrix counts rather than example-by-example inspection.</w:t>
-      </w:r>
-    </w:p>
-    <w:p>
-      <w:pPr>
-        <w:spacing w:after="120" w:before="480" w:line="240" w:lineRule="auto"/>
-        <w:jc w:val="both"/>
-        <w:rPr>
-          <w:b w:val="1"/>
-          <w:bCs w:val="1"/>
-          <w:sz w:val="48"/>
-          <w:szCs w:val="48"/>
-        </w:rPr>
-      </w:pPr>
-      <w:r>
-        <w:rPr>
-          <w:b w:val="1"/>
-          <w:bCs w:val="1"/>
-          <w:sz w:val="46"/>
-          <w:szCs w:val="46"/>
-          <w:rtl w:val="0"/>
-        </w:rPr>
-        <w:t xml:space="preserve">8. PROBLEMS ENCOUNTERED AND LIMITATIONS</w:t>
-      </w:r>
-    </w:p>
-    <w:p>
-      <w:pPr>
-        <w:spacing w:after="160" w:line="240" w:lineRule="auto"/>
-        <w:jc w:val="both"/>
-        <w:rPr/>
-      </w:pPr>
-      <w:r>
-        <w:rPr>
-          <w:rtl w:val="0"/>
-        </w:rPr>
-        <w:t xml:space="preserve">All training images come from a single landfill facility and camera setup, so performance on a different camera, background, or lighting is not yet measured; the external cross-dataset test described in Section 6.5 is prepared but not yet populated with images. The selected 5-class subset is imbalanced (Plastic 921 vs. Glass 420 images), addressed with class weights but not eliminated as a source of bias. The system recognizes exactly one of the five trained classes per image; an object outside these classes, or an image containing more than one item, is forced into the closest of the five rather than rejected. Individual misclassified example images for this run were not retained, which limits qualitative error analysis to the aggregate confusion matrix (Section 6.3).</w:t>
-      </w:r>
-    </w:p>
-    <w:p>
-      <w:pPr>
-        <w:spacing w:after="120" w:before="480" w:line="240" w:lineRule="auto"/>
-        <w:jc w:val="both"/>
-        <w:rPr>
-          <w:b w:val="1"/>
-          <w:bCs w:val="1"/>
-          <w:sz w:val="48"/>
-          <w:szCs w:val="48"/>
-        </w:rPr>
-      </w:pPr>
-      <w:r>
-        <w:rPr>
-          <w:b w:val="1"/>
-          <w:bCs w:val="1"/>
-          <w:sz w:val="46"/>
-          <w:szCs w:val="46"/>
-          <w:rtl w:val="0"/>
-        </w:rPr>
-        <w:t xml:space="preserve">9. CONCLUSION AND RECOMMENDATIONS</w:t>
-      </w:r>
-    </w:p>
-    <w:p>
-      <w:pPr>
-        <w:spacing w:after="120" w:before="360" w:line="240" w:lineRule="auto"/>
-        <w:jc w:val="both"/>
-        <w:rPr>
-          <w:b w:val="1"/>
-          <w:bCs w:val="1"/>
-          <w:sz w:val="36"/>
-          <w:szCs w:val="36"/>
-        </w:rPr>
-      </w:pPr>
-      <w:r>
-        <w:rPr>
-          <w:sz w:val="32"/>
-          <w:szCs w:val="32"/>
-          <w:rtl w:val="0"/>
-        </w:rPr>
-        <w:t xml:space="preserve">9.1 Conclusion</w:t>
-      </w:r>
-    </w:p>
-    <w:p>
-      <w:pPr>
-        <w:spacing w:after="160" w:line="240" w:lineRule="auto"/>
-        <w:jc w:val="both"/>
-        <w:rPr/>
-      </w:pPr>
-      <w:r>
-        <w:rPr>
-          <w:rtl w:val="0"/>
-        </w:rPr>
-        <w:t xml:space="preserve">The group built and evaluated a 5-class waste-image classifier (Cardboard, Glass, Metal, Paper, Plastic) using MobileNetV2 transfer learning on the RealWaste dataset, satisfying the Midterm requirements for Specialization 8 (Object Sorting): at least 4 classes with at least 100 images each, a prepared train/validation/test split, image preprocessing and augmentation, a working CV model, and evaluation with accuracy metrics and a confusion matrix. The final test accuracy is 87.93% (macro F1 0.878), short of the group's internal 90% target but demonstrating a working SEE → RECOGNIZE pipeline with a visible label and confidence output.</w:t>
-      </w:r>
-    </w:p>
-    <w:p>
-      <w:pPr>
-        <w:spacing w:after="120" w:before="360" w:line="240" w:lineRule="auto"/>
-        <w:jc w:val="both"/>
-        <w:rPr>
-          <w:b w:val="1"/>
-          <w:bCs w:val="1"/>
-          <w:sz w:val="36"/>
-          <w:szCs w:val="36"/>
-        </w:rPr>
-      </w:pPr>
-      <w:r>
-        <w:rPr>
-          <w:sz w:val="32"/>
-          <w:szCs w:val="32"/>
-          <w:rtl w:val="0"/>
-        </w:rPr>
-        <w:t xml:space="preserve">9.2 Recommendations</w:t>
+        <w:t xml:space="preserve">An external, cross-dataset test set of 100 openly licensed public images (20 per class) was assembled and evaluated to check generalization beyond RealWaste's own single-facility photography. Images come from TrashNet (Thung &amp; Yang, 2017; MIT License; 91 images, single object on a white posterboard) and Wikimedia Commons (various contributors, per-image CC0/CC BY/CC BY-SA licenses; 9 images). None of these images were taken by the group. Each image was checked against all 4,752 RealWaste images with perceptual hashing; 0 matches were found (closest same-class distance 8, above the match threshold of 5), confirming no overlap with the training data.</w:t>
       </w:r>
     </w:p>
     <w:p>
@@ -9215,13 +8982,794 @@
           <w:bCs w:val="1"/>
           <w:rtl w:val="0"/>
         </w:rPr>
-        <w:t xml:space="preserve">Populate and run the external cross-dataset test. </w:t>
-      </w:r>
-      <w:r>
-        <w:rPr>
-          <w:rtl w:val="0"/>
-        </w:rPr>
-        <w:t xml:space="preserve">Add openly licensed public images to the prepared external_test/ class folders and evaluate the model on them to get a measured generalization accuracy before the Final stage, rather than relying on the RealWaste test split alone (Section 6.5).</w:t>
+        <w:t xml:space="preserve">External test accuracy: 65.0% </w:t>
+      </w:r>
+      <w:r>
+        <w:rPr>
+          <w:rtl w:val="0"/>
+        </w:rPr>
+        <w:t xml:space="preserve">(65 of 100), well below the 87.93% RealWaste test accuracy (Section 6.3).</w:t>
+      </w:r>
+    </w:p>
+    <w:tbl>
+      <w:tblPr>
+        <w:tblStyle w:val="Table1"/>
+        <w:tblW w:w="9300.0" w:type="dxa"/>
+        <w:jc w:val="left"/>
+        <w:tblBorders>
+          <w:top w:color="000000" w:space="0" w:sz="8" w:val="single"/>
+          <w:left w:color="000000" w:space="0" w:sz="8" w:val="single"/>
+          <w:bottom w:color="000000" w:space="0" w:sz="8" w:val="single"/>
+          <w:right w:color="000000" w:space="0" w:sz="8" w:val="single"/>
+          <w:insideH w:color="000000" w:space="0" w:sz="8" w:val="single"/>
+          <w:insideV w:color="000000" w:space="0" w:sz="8" w:val="single"/>
+        </w:tblBorders>
+        <w:tblLayout w:type="fixed"/>
+        <w:tblLook w:val="0600"/>
+      </w:tblPr>
+      <w:tblGrid>
+        <w:gridCol w:w="1455"/>
+        <w:gridCol w:w="1995"/>
+        <w:tblGridChange w:id="0">
+          <w:tblGrid>
+            <w:gridCol w:w="1455"/>
+            <w:gridCol w:w="1995"/>
+            <w:gridCol w:w="1935"/>
+            <w:gridCol w:w="2055"/>
+            <w:gridCol w:w="1860"/>
+          </w:tblGrid>
+        </w:tblGridChange>
+      </w:tblGrid>
+      <w:tr>
+        <w:trPr>
+          <w:cantSplit w:val="0"/>
+          <w:tblHeader w:val="0"/>
+        </w:trPr>
+        <w:tc>
+          <w:tcPr>
+            <w:tcBorders>
+              <w:top w:color="000000" w:space="0" w:sz="7" w:val="single"/>
+              <w:left w:color="000000" w:space="0" w:sz="7" w:val="single"/>
+              <w:bottom w:color="000000" w:space="0" w:sz="7" w:val="single"/>
+              <w:right w:color="000000" w:space="0" w:sz="7" w:val="single"/>
+            </w:tcBorders>
+            <w:shd w:fill="fff2cc" w:val="clear"/>
+            <w:tcMar>
+              <w:top w:w="100.0" w:type="dxa"/>
+              <w:left w:w="100.0" w:type="dxa"/>
+              <w:bottom w:w="100.0" w:type="dxa"/>
+              <w:right w:w="100.0" w:type="dxa"/>
+            </w:tcMar>
+            <w:vAlign w:val="top"/>
+          </w:tcPr>
+          <w:p>
+            <w:pPr>
+              <w:widowControl w:val="0"/>
+              <w:spacing w:after="40" w:before="40" w:line="240" w:lineRule="auto"/>
+              <w:jc w:val="both"/>
+              <w:rPr>
+                <w:b w:val="1"/>
+                <w:bCs w:val="1"/>
+              </w:rPr>
+            </w:pPr>
+            <w:r>
+              <w:rPr>
+                <w:b/>
+                <w:bCs w:val="1"/>
+                <w:rtl w:val="0"/>
+              </w:rPr>
+              <w:t>Class</w:t>
+            </w:r>
+          </w:p>
+        </w:tc>
+        <w:tc>
+          <w:tcPr>
+            <w:tcBorders>
+              <w:top w:color="000000" w:space="0" w:sz="7" w:val="single"/>
+              <w:left w:color="000000" w:space="0" w:sz="0" w:val="nil"/>
+              <w:bottom w:color="000000" w:space="0" w:sz="7" w:val="single"/>
+              <w:right w:color="000000" w:space="0" w:sz="7" w:val="single"/>
+            </w:tcBorders>
+            <w:shd w:fill="fff2cc" w:val="clear"/>
+            <w:tcMar>
+              <w:top w:w="100.0" w:type="dxa"/>
+              <w:left w:w="100.0" w:type="dxa"/>
+              <w:bottom w:w="100.0" w:type="dxa"/>
+              <w:right w:w="100.0" w:type="dxa"/>
+            </w:tcMar>
+            <w:vAlign w:val="top"/>
+          </w:tcPr>
+          <w:p>
+            <w:pPr>
+              <w:widowControl w:val="0"/>
+              <w:spacing w:after="40" w:before="40" w:line="240" w:lineRule="auto"/>
+              <w:jc w:val="both"/>
+              <w:rPr>
+                <w:b w:val="1"/>
+                <w:bCs w:val="1"/>
+              </w:rPr>
+            </w:pPr>
+            <w:r>
+              <w:rPr>
+                <w:b/>
+                <w:bCs w:val="1"/>
+                <w:rtl w:val="0"/>
+              </w:rPr>
+              <w:t>Accuracy (correct/20)</w:t>
+            </w:r>
+          </w:p>
+        </w:tc>
+      </w:tr>
+      <w:tr>
+        <w:trPr>
+          <w:cantSplit w:val="0"/>
+          <w:tblHeader w:val="0"/>
+        </w:trPr>
+        <w:tc>
+          <w:tcPr>
+            <w:tcBorders>
+              <w:top w:color="000000" w:space="0" w:sz="0" w:val="nil"/>
+              <w:left w:color="000000" w:space="0" w:sz="7" w:val="single"/>
+              <w:bottom w:color="000000" w:space="0" w:sz="7" w:val="single"/>
+              <w:right w:color="000000" w:space="0" w:sz="7" w:val="single"/>
+            </w:tcBorders>
+            <w:tcMar>
+              <w:top w:w="100.0" w:type="dxa"/>
+              <w:left w:w="100.0" w:type="dxa"/>
+              <w:bottom w:w="100.0" w:type="dxa"/>
+              <w:right w:w="100.0" w:type="dxa"/>
+            </w:tcMar>
+            <w:vAlign w:val="top"/>
+          </w:tcPr>
+          <w:p>
+            <w:pPr>
+              <w:widowControl w:val="0"/>
+              <w:spacing w:after="40" w:before="40" w:line="240" w:lineRule="auto"/>
+              <w:jc w:val="both"/>
+              <w:rPr/>
+            </w:pPr>
+            <w:r>
+              <w:rPr>
+                <w:b w:val="0"/>
+                <w:rtl w:val="0"/>
+              </w:rPr>
+              <w:t>Cardboard</w:t>
+            </w:r>
+          </w:p>
+        </w:tc>
+        <w:tc>
+          <w:tcPr>
+            <w:tcBorders>
+              <w:top w:color="000000" w:space="0" w:sz="0" w:val="nil"/>
+              <w:left w:color="000000" w:space="0" w:sz="0" w:val="nil"/>
+              <w:bottom w:color="000000" w:space="0" w:sz="7" w:val="single"/>
+              <w:right w:color="000000" w:space="0" w:sz="7" w:val="single"/>
+            </w:tcBorders>
+            <w:tcMar>
+              <w:top w:w="100.0" w:type="dxa"/>
+              <w:left w:w="100.0" w:type="dxa"/>
+              <w:bottom w:w="100.0" w:type="dxa"/>
+              <w:right w:w="100.0" w:type="dxa"/>
+            </w:tcMar>
+            <w:vAlign w:val="top"/>
+          </w:tcPr>
+          <w:p>
+            <w:pPr>
+              <w:widowControl w:val="0"/>
+              <w:spacing w:after="40" w:before="40" w:line="240" w:lineRule="auto"/>
+              <w:jc w:val="both"/>
+              <w:rPr/>
+            </w:pPr>
+            <w:r>
+              <w:rPr>
+                <w:b w:val="0"/>
+                <w:rtl w:val="0"/>
+              </w:rPr>
+              <w:t>80.0% (16/20)</w:t>
+            </w:r>
+          </w:p>
+        </w:tc>
+      </w:tr>
+      <w:tr>
+        <w:trPr>
+          <w:cantSplit w:val="0"/>
+          <w:tblHeader w:val="0"/>
+        </w:trPr>
+        <w:tc>
+          <w:tcPr>
+            <w:tcBorders>
+              <w:top w:color="000000" w:space="0" w:sz="0" w:val="nil"/>
+              <w:left w:color="000000" w:space="0" w:sz="7" w:val="single"/>
+              <w:bottom w:color="000000" w:space="0" w:sz="7" w:val="single"/>
+              <w:right w:color="000000" w:space="0" w:sz="7" w:val="single"/>
+            </w:tcBorders>
+            <w:tcMar>
+              <w:top w:w="100.0" w:type="dxa"/>
+              <w:left w:w="100.0" w:type="dxa"/>
+              <w:bottom w:w="100.0" w:type="dxa"/>
+              <w:right w:w="100.0" w:type="dxa"/>
+            </w:tcMar>
+            <w:vAlign w:val="top"/>
+          </w:tcPr>
+          <w:p>
+            <w:pPr>
+              <w:widowControl w:val="0"/>
+              <w:spacing w:after="40" w:before="40" w:line="240" w:lineRule="auto"/>
+              <w:jc w:val="both"/>
+              <w:rPr/>
+            </w:pPr>
+            <w:r>
+              <w:rPr>
+                <w:b w:val="0"/>
+                <w:rtl w:val="0"/>
+              </w:rPr>
+              <w:t>Glass</w:t>
+            </w:r>
+          </w:p>
+        </w:tc>
+        <w:tc>
+          <w:tcPr>
+            <w:tcBorders>
+              <w:top w:color="000000" w:space="0" w:sz="0" w:val="nil"/>
+              <w:left w:color="000000" w:space="0" w:sz="0" w:val="nil"/>
+              <w:bottom w:color="000000" w:space="0" w:sz="7" w:val="single"/>
+              <w:right w:color="000000" w:space="0" w:sz="7" w:val="single"/>
+            </w:tcBorders>
+            <w:tcMar>
+              <w:top w:w="100.0" w:type="dxa"/>
+              <w:left w:w="100.0" w:type="dxa"/>
+              <w:bottom w:w="100.0" w:type="dxa"/>
+              <w:right w:w="100.0" w:type="dxa"/>
+            </w:tcMar>
+            <w:vAlign w:val="top"/>
+          </w:tcPr>
+          <w:p>
+            <w:pPr>
+              <w:widowControl w:val="0"/>
+              <w:spacing w:after="40" w:before="40" w:line="240" w:lineRule="auto"/>
+              <w:jc w:val="both"/>
+              <w:rPr/>
+            </w:pPr>
+            <w:r>
+              <w:rPr>
+                <w:b w:val="0"/>
+                <w:rtl w:val="0"/>
+              </w:rPr>
+              <w:t>65.0% (13/20)</w:t>
+            </w:r>
+          </w:p>
+        </w:tc>
+      </w:tr>
+      <w:tr>
+        <w:trPr>
+          <w:cantSplit w:val="0"/>
+          <w:tblHeader w:val="0"/>
+        </w:trPr>
+        <w:tc>
+          <w:tcPr>
+            <w:tcBorders>
+              <w:top w:color="000000" w:space="0" w:sz="0" w:val="nil"/>
+              <w:left w:color="000000" w:space="0" w:sz="7" w:val="single"/>
+              <w:bottom w:color="000000" w:space="0" w:sz="7" w:val="single"/>
+              <w:right w:color="000000" w:space="0" w:sz="7" w:val="single"/>
+            </w:tcBorders>
+            <w:tcMar>
+              <w:top w:w="100.0" w:type="dxa"/>
+              <w:left w:w="100.0" w:type="dxa"/>
+              <w:bottom w:w="100.0" w:type="dxa"/>
+              <w:right w:w="100.0" w:type="dxa"/>
+            </w:tcMar>
+            <w:vAlign w:val="top"/>
+          </w:tcPr>
+          <w:p>
+            <w:pPr>
+              <w:widowControl w:val="0"/>
+              <w:spacing w:after="40" w:before="40" w:line="240" w:lineRule="auto"/>
+              <w:jc w:val="both"/>
+              <w:rPr/>
+            </w:pPr>
+            <w:r>
+              <w:rPr>
+                <w:b w:val="0"/>
+                <w:rtl w:val="0"/>
+              </w:rPr>
+              <w:t>Metal</w:t>
+            </w:r>
+          </w:p>
+        </w:tc>
+        <w:tc>
+          <w:tcPr>
+            <w:tcBorders>
+              <w:top w:color="000000" w:space="0" w:sz="0" w:val="nil"/>
+              <w:left w:color="000000" w:space="0" w:sz="0" w:val="nil"/>
+              <w:bottom w:color="000000" w:space="0" w:sz="7" w:val="single"/>
+              <w:right w:color="000000" w:space="0" w:sz="7" w:val="single"/>
+            </w:tcBorders>
+            <w:tcMar>
+              <w:top w:w="100.0" w:type="dxa"/>
+              <w:left w:w="100.0" w:type="dxa"/>
+              <w:bottom w:w="100.0" w:type="dxa"/>
+              <w:right w:w="100.0" w:type="dxa"/>
+            </w:tcMar>
+            <w:vAlign w:val="top"/>
+          </w:tcPr>
+          <w:p>
+            <w:pPr>
+              <w:widowControl w:val="0"/>
+              <w:spacing w:after="40" w:before="40" w:line="240" w:lineRule="auto"/>
+              <w:jc w:val="both"/>
+              <w:rPr/>
+            </w:pPr>
+            <w:r>
+              <w:rPr>
+                <w:b w:val="0"/>
+                <w:rtl w:val="0"/>
+              </w:rPr>
+              <w:t>80.0% (16/20)</w:t>
+            </w:r>
+          </w:p>
+        </w:tc>
+      </w:tr>
+      <w:tr>
+        <w:trPr>
+          <w:cantSplit w:val="0"/>
+          <w:tblHeader w:val="0"/>
+        </w:trPr>
+        <w:tc>
+          <w:tcPr>
+            <w:tcBorders>
+              <w:top w:color="000000" w:space="0" w:sz="0" w:val="nil"/>
+              <w:left w:color="000000" w:space="0" w:sz="7" w:val="single"/>
+              <w:bottom w:color="000000" w:space="0" w:sz="7" w:val="single"/>
+              <w:right w:color="000000" w:space="0" w:sz="7" w:val="single"/>
+            </w:tcBorders>
+            <w:tcMar>
+              <w:top w:w="100.0" w:type="dxa"/>
+              <w:left w:w="100.0" w:type="dxa"/>
+              <w:bottom w:w="100.0" w:type="dxa"/>
+              <w:right w:w="100.0" w:type="dxa"/>
+            </w:tcMar>
+            <w:vAlign w:val="top"/>
+          </w:tcPr>
+          <w:p>
+            <w:pPr>
+              <w:widowControl w:val="0"/>
+              <w:spacing w:after="40" w:before="40" w:line="240" w:lineRule="auto"/>
+              <w:jc w:val="both"/>
+              <w:rPr/>
+            </w:pPr>
+            <w:r>
+              <w:rPr>
+                <w:b w:val="0"/>
+                <w:rtl w:val="0"/>
+              </w:rPr>
+              <w:t>Paper</w:t>
+            </w:r>
+          </w:p>
+        </w:tc>
+        <w:tc>
+          <w:tcPr>
+            <w:tcBorders>
+              <w:top w:color="000000" w:space="0" w:sz="0" w:val="nil"/>
+              <w:left w:color="000000" w:space="0" w:sz="0" w:val="nil"/>
+              <w:bottom w:color="000000" w:space="0" w:sz="7" w:val="single"/>
+              <w:right w:color="000000" w:space="0" w:sz="7" w:val="single"/>
+            </w:tcBorders>
+            <w:tcMar>
+              <w:top w:w="100.0" w:type="dxa"/>
+              <w:left w:w="100.0" w:type="dxa"/>
+              <w:bottom w:w="100.0" w:type="dxa"/>
+              <w:right w:w="100.0" w:type="dxa"/>
+            </w:tcMar>
+            <w:vAlign w:val="top"/>
+          </w:tcPr>
+          <w:p>
+            <w:pPr>
+              <w:widowControl w:val="0"/>
+              <w:spacing w:after="40" w:before="40" w:line="240" w:lineRule="auto"/>
+              <w:jc w:val="both"/>
+              <w:rPr/>
+            </w:pPr>
+            <w:r>
+              <w:rPr>
+                <w:b w:val="0"/>
+                <w:rtl w:val="0"/>
+              </w:rPr>
+              <w:t>55.0% (11/20)</w:t>
+            </w:r>
+          </w:p>
+        </w:tc>
+      </w:tr>
+      <w:tr>
+        <w:trPr>
+          <w:cantSplit w:val="0"/>
+          <w:tblHeader w:val="0"/>
+        </w:trPr>
+        <w:tc>
+          <w:tcPr>
+            <w:tcBorders>
+              <w:top w:color="000000" w:space="0" w:sz="0" w:val="nil"/>
+              <w:left w:color="000000" w:space="0" w:sz="7" w:val="single"/>
+              <w:bottom w:color="000000" w:space="0" w:sz="7" w:val="single"/>
+              <w:right w:color="000000" w:space="0" w:sz="7" w:val="single"/>
+            </w:tcBorders>
+            <w:tcMar>
+              <w:top w:w="100.0" w:type="dxa"/>
+              <w:left w:w="100.0" w:type="dxa"/>
+              <w:bottom w:w="100.0" w:type="dxa"/>
+              <w:right w:w="100.0" w:type="dxa"/>
+            </w:tcMar>
+            <w:vAlign w:val="top"/>
+          </w:tcPr>
+          <w:p>
+            <w:pPr>
+              <w:widowControl w:val="0"/>
+              <w:spacing w:after="40" w:before="40" w:line="240" w:lineRule="auto"/>
+              <w:jc w:val="both"/>
+              <w:rPr/>
+            </w:pPr>
+            <w:r>
+              <w:rPr>
+                <w:b w:val="0"/>
+                <w:rtl w:val="0"/>
+              </w:rPr>
+              <w:t>Plastic</w:t>
+            </w:r>
+          </w:p>
+        </w:tc>
+        <w:tc>
+          <w:tcPr>
+            <w:tcBorders>
+              <w:top w:color="000000" w:space="0" w:sz="0" w:val="nil"/>
+              <w:left w:color="000000" w:space="0" w:sz="0" w:val="nil"/>
+              <w:bottom w:color="000000" w:space="0" w:sz="7" w:val="single"/>
+              <w:right w:color="000000" w:space="0" w:sz="7" w:val="single"/>
+            </w:tcBorders>
+            <w:tcMar>
+              <w:top w:w="100.0" w:type="dxa"/>
+              <w:left w:w="100.0" w:type="dxa"/>
+              <w:bottom w:w="100.0" w:type="dxa"/>
+              <w:right w:w="100.0" w:type="dxa"/>
+            </w:tcMar>
+            <w:vAlign w:val="top"/>
+          </w:tcPr>
+          <w:p>
+            <w:pPr>
+              <w:widowControl w:val="0"/>
+              <w:spacing w:after="40" w:before="40" w:line="240" w:lineRule="auto"/>
+              <w:jc w:val="both"/>
+              <w:rPr/>
+            </w:pPr>
+            <w:r>
+              <w:rPr>
+                <w:b w:val="0"/>
+                <w:rtl w:val="0"/>
+              </w:rPr>
+              <w:t>45.0% (9/20)</w:t>
+            </w:r>
+          </w:p>
+        </w:tc>
+      </w:tr>
+    </w:tbl>
+    <w:p>
+      <w:pPr>
+        <w:spacing w:after="240" w:before="240" w:line="240" w:lineRule="auto"/>
+        <w:jc w:val="center"/>
+        <w:rPr>
+          <w:b w:val="1"/>
+          <w:bCs w:val="1"/>
+        </w:rPr>
+      </w:pPr>
+      <w:r>
+        <w:rPr>
+          <w:b w:val="1"/>
+          <w:bCs w:val="1"/>
+          <w:rtl w:val="0"/>
+        </w:rPr>
+        <w:t xml:space="preserve">Table 6. Per-class accuracy on the 100-image external cross-dataset test set.</w:t>
+      </w:r>
+    </w:p>
+    <w:p>
+      <w:pPr>
+        <w:spacing w:after="240" w:before="240" w:line="240" w:lineRule="auto"/>
+        <w:jc w:val="center"/>
+        <w:rPr/>
+      </w:pPr>
+      <w:r>
+        <w:drawing>
+          <wp:inline>
+            <wp:extent cx="4572000" cy="3609474"/>
+            <wp:docPr id="5" name="Picture 5"/>
+            <wp:cNvGraphicFramePr>
+              <a:graphicFrameLocks noChangeAspect="1"/>
+            </wp:cNvGraphicFramePr>
+            <a:graphic>
+              <a:graphicData uri="http://schemas.openxmlformats.org/drawingml/2006/picture">
+                <pic:pic>
+                  <pic:nvPicPr>
+                    <pic:cNvPr id="0" name="confusion_matrix_external.png"/>
+                    <pic:cNvPicPr/>
+                  </pic:nvPicPr>
+                  <pic:blipFill>
+                    <a:blip r:embed="rId12"/>
+                    <a:stretch>
+                      <a:fillRect/>
+                    </a:stretch>
+                  </pic:blipFill>
+                  <pic:spPr>
+                    <a:xfrm>
+                      <a:off x="0" y="0"/>
+                      <a:ext cx="4572000" cy="3609474"/>
+                    </a:xfrm>
+                    <a:prstGeom prst="rect"/>
+                  </pic:spPr>
+                </pic:pic>
+              </a:graphicData>
+            </a:graphic>
+          </wp:inline>
+        </w:drawing>
+      </w:r>
+    </w:p>
+    <w:p>
+      <w:pPr>
+        <w:spacing w:after="200" w:line="240" w:lineRule="auto"/>
+        <w:jc w:val="center"/>
+        <w:rPr>
+          <w:b w:val="1"/>
+          <w:bCs w:val="1"/>
+        </w:rPr>
+      </w:pPr>
+      <w:r>
+        <w:rPr>
+          <w:b w:val="1"/>
+          <w:bCs w:val="1"/>
+          <w:rtl w:val="0"/>
+        </w:rPr>
+        <w:t xml:space="preserve">Figure 5. Confusion matrix on the 100-image external test set (TrashNet + Wikimedia Commons).</w:t>
+      </w:r>
+    </w:p>
+    <w:p>
+      <w:pPr>
+        <w:spacing w:after="160" w:line="240" w:lineRule="auto"/>
+        <w:jc w:val="both"/>
+        <w:rPr/>
+      </w:pPr>
+      <w:r>
+        <w:rPr>
+          <w:rtl w:val="0"/>
+        </w:rPr>
+        <w:t xml:space="preserve">The drop from 87.93% to 65.0% is domain shift: RealWaste's training photos were all taken at one landfill facility's point of reception, while the external images are everyday, single-object photos from varied cameras and backgrounds, which the model was never trained on. The largest error is Paper→Cardboard (8 of 20 Paper images), and Plastic is confused with Glass in both directions (6 Plastic→Glass, 4 Glass→Plastic); Cardboard and Metal generalize best (80% each). Full source attribution and license details are kept alongside the test images rather than in this report.</w:t>
+      </w:r>
+    </w:p>
+    <w:p>
+      <w:pPr>
+        <w:spacing w:after="120" w:before="480" w:line="240" w:lineRule="auto"/>
+        <w:jc w:val="both"/>
+        <w:rPr>
+          <w:b w:val="1"/>
+          <w:bCs w:val="1"/>
+          <w:sz w:val="48"/>
+          <w:szCs w:val="48"/>
+        </w:rPr>
+      </w:pPr>
+      <w:r>
+        <w:rPr>
+          <w:b w:val="1"/>
+          <w:bCs w:val="1"/>
+          <w:sz w:val="46"/>
+          <w:szCs w:val="46"/>
+          <w:rtl w:val="0"/>
+        </w:rPr>
+        <w:t xml:space="preserve">7. RESULTS AND DISCUSSION</w:t>
+      </w:r>
+    </w:p>
+    <w:p>
+      <w:pPr>
+        <w:spacing w:after="120" w:before="360" w:line="240" w:lineRule="auto"/>
+        <w:jc w:val="both"/>
+        <w:rPr>
+          <w:b w:val="1"/>
+          <w:bCs w:val="1"/>
+          <w:sz w:val="36"/>
+          <w:szCs w:val="36"/>
+        </w:rPr>
+      </w:pPr>
+      <w:r>
+        <w:rPr>
+          <w:sz w:val="32"/>
+          <w:szCs w:val="32"/>
+          <w:rtl w:val="0"/>
+        </w:rPr>
+        <w:t xml:space="preserve">7.1 Computer Vision Results</w:t>
+      </w:r>
+    </w:p>
+    <w:p>
+      <w:pPr>
+        <w:spacing w:after="160" w:line="240" w:lineRule="auto"/>
+        <w:jc w:val="both"/>
+        <w:rPr/>
+      </w:pPr>
+      <w:r>
+        <w:rPr>
+          <w:rtl w:val="0"/>
+        </w:rPr>
+        <w:t xml:space="preserve">The MobileNetV2 transfer-learning model reaches 87.93% accuracy on the held-out RealWaste test set (5 classes, 464 images), with macro F1 0.878. All five classes score an F1 above 0.86, with no single class dragging the average down.</w:t>
+      </w:r>
+    </w:p>
+    <w:p>
+      <w:pPr>
+        <w:spacing w:after="120" w:before="360" w:line="240" w:lineRule="auto"/>
+        <w:jc w:val="both"/>
+        <w:rPr>
+          <w:b w:val="1"/>
+          <w:bCs w:val="1"/>
+          <w:sz w:val="36"/>
+          <w:szCs w:val="36"/>
+        </w:rPr>
+      </w:pPr>
+      <w:r>
+        <w:rPr>
+          <w:sz w:val="32"/>
+          <w:szCs w:val="32"/>
+          <w:rtl w:val="0"/>
+        </w:rPr>
+        <w:t xml:space="preserve">7.2 Analysis of Results</w:t>
+      </w:r>
+    </w:p>
+    <w:p>
+      <w:pPr>
+        <w:spacing w:after="160" w:line="240" w:lineRule="auto"/>
+        <w:jc w:val="both"/>
+        <w:rPr/>
+      </w:pPr>
+      <w:r>
+        <w:rPr>
+          <w:rtl w:val="0"/>
+        </w:rPr>
+        <w:t xml:space="preserve">Paper (recall 94.7%) and Plastic (precision 90.0%) are the most reliably recognized classes. Metal is most often confused with Plastic (9 mistakes out of 464 test images), and Plastic is confused with both Glass (8) and Metal (8), consistent with those classes often containing shiny, reflective, or clear surfaces under the dataset's landfill lighting. Cardboard is most often confused with Paper (7 mistakes), which share similar color and fibrous texture, exactly the confusion the group anticipated in Section 1.4. The 87.93% result is 2.07 percentage points below the 90% objective set in Section 1.3; given that the dataset is imbalanced and visually ambiguous for several class pairs, the group considers this a reasonable result rather than a failed one, with room to close the gap through the recommendations in Section 9.2 rather than a change of approach.</w:t>
+      </w:r>
+    </w:p>
+    <w:p>
+      <w:pPr>
+        <w:spacing w:after="120" w:before="360" w:line="240" w:lineRule="auto"/>
+        <w:jc w:val="both"/>
+        <w:rPr>
+          <w:b w:val="1"/>
+          <w:bCs w:val="1"/>
+          <w:sz w:val="36"/>
+          <w:szCs w:val="36"/>
+        </w:rPr>
+      </w:pPr>
+      <w:r>
+        <w:rPr>
+          <w:sz w:val="32"/>
+          <w:szCs w:val="32"/>
+          <w:rtl w:val="0"/>
+        </w:rPr>
+        <w:t xml:space="preserve">7.3 Errors and Failure Cases</w:t>
+      </w:r>
+    </w:p>
+    <w:p>
+      <w:pPr>
+        <w:spacing w:after="160" w:line="240" w:lineRule="auto"/>
+        <w:jc w:val="both"/>
+        <w:rPr/>
+      </w:pPr>
+      <w:r>
+        <w:rPr>
+          <w:rtl w:val="0"/>
+        </w:rPr>
+        <w:t xml:space="preserve">On the RealWaste test set, the dominant failure mode is confusion between visually similar material classes (Metal→Plastic, Plastic↔Glass/Metal, Cardboard→Paper; Section 6.3), not random or unexplainable errors. On the external test set (Section 6.5), the same kind of confusion appears but is larger: Paper→Cardboard (8 of 20) is now the single biggest error cell, and Plastic↔Glass confusion (6 and 4 images respectively) again shows up in both directions. This points to the model leaning on texture and color cues (cardboard-like brown tones, glass-like transparency) that do not reliably separate these classes once the images come from a different camera and setting than RealWaste's own landfill photography.</w:t>
+      </w:r>
+    </w:p>
+    <w:p>
+      <w:pPr>
+        <w:spacing w:after="120" w:before="480" w:line="240" w:lineRule="auto"/>
+        <w:jc w:val="both"/>
+        <w:rPr>
+          <w:b w:val="1"/>
+          <w:bCs w:val="1"/>
+          <w:sz w:val="48"/>
+          <w:szCs w:val="48"/>
+        </w:rPr>
+      </w:pPr>
+      <w:r>
+        <w:rPr>
+          <w:b w:val="1"/>
+          <w:bCs w:val="1"/>
+          <w:sz w:val="46"/>
+          <w:szCs w:val="46"/>
+          <w:rtl w:val="0"/>
+        </w:rPr>
+        <w:t xml:space="preserve">8. PROBLEMS ENCOUNTERED AND LIMITATIONS</w:t>
+      </w:r>
+    </w:p>
+    <w:p>
+      <w:pPr>
+        <w:spacing w:after="160" w:line="240" w:lineRule="auto"/>
+        <w:jc w:val="both"/>
+        <w:rPr/>
+      </w:pPr>
+      <w:r>
+        <w:rPr>
+          <w:rtl w:val="0"/>
+        </w:rPr>
+        <w:t xml:space="preserve">All training images come from a single landfill facility and camera setup; the external cross-dataset test (Section 6.5) confirms this limits generalization, dropping accuracy from 87.93% to 65.0% on everyday photos from a different source. The selected 5-class subset is imbalanced (Plastic 921 vs. Glass 420 images), addressed with class weights but not eliminated as a source of bias. The system recognizes exactly one of the five trained classes per image; an object outside these classes, or an image containing more than one item, is forced into the closest of the five rather than rejected. Individual misclassified example images from the RealWaste test set were not retained, which limits qualitative error analysis to the aggregate confusion matrix (Section 6.3).</w:t>
+      </w:r>
+    </w:p>
+    <w:p>
+      <w:pPr>
+        <w:spacing w:after="120" w:before="480" w:line="240" w:lineRule="auto"/>
+        <w:jc w:val="both"/>
+        <w:rPr>
+          <w:b w:val="1"/>
+          <w:bCs w:val="1"/>
+          <w:sz w:val="48"/>
+          <w:szCs w:val="48"/>
+        </w:rPr>
+      </w:pPr>
+      <w:r>
+        <w:rPr>
+          <w:b w:val="1"/>
+          <w:bCs w:val="1"/>
+          <w:sz w:val="46"/>
+          <w:szCs w:val="46"/>
+          <w:rtl w:val="0"/>
+        </w:rPr>
+        <w:t xml:space="preserve">9. CONCLUSION AND RECOMMENDATIONS</w:t>
+      </w:r>
+    </w:p>
+    <w:p>
+      <w:pPr>
+        <w:spacing w:after="120" w:before="360" w:line="240" w:lineRule="auto"/>
+        <w:jc w:val="both"/>
+        <w:rPr>
+          <w:b w:val="1"/>
+          <w:bCs w:val="1"/>
+          <w:sz w:val="36"/>
+          <w:szCs w:val="36"/>
+        </w:rPr>
+      </w:pPr>
+      <w:r>
+        <w:rPr>
+          <w:sz w:val="32"/>
+          <w:szCs w:val="32"/>
+          <w:rtl w:val="0"/>
+        </w:rPr>
+        <w:t xml:space="preserve">9.1 Conclusion</w:t>
+      </w:r>
+    </w:p>
+    <w:p>
+      <w:pPr>
+        <w:spacing w:after="160" w:line="240" w:lineRule="auto"/>
+        <w:jc w:val="both"/>
+        <w:rPr/>
+      </w:pPr>
+      <w:r>
+        <w:rPr>
+          <w:rtl w:val="0"/>
+        </w:rPr>
+        <w:t xml:space="preserve">The group built and evaluated a 5-class waste-image classifier (Cardboard, Glass, Metal, Paper, Plastic) using MobileNetV2 transfer learning on the RealWaste dataset, satisfying the Midterm requirements for Specialization 8 (Object Sorting): at least 4 classes with at least 100 images each, a prepared train/validation/test split, image preprocessing and augmentation, a working CV model, and evaluation with accuracy metrics and a confusion matrix. The final test accuracy is 87.93% (macro F1 0.878), short of the group's internal 90% target but demonstrating a working SEE → RECOGNIZE pipeline with a visible label and confidence output.</w:t>
+      </w:r>
+    </w:p>
+    <w:p>
+      <w:pPr>
+        <w:spacing w:after="120" w:before="360" w:line="240" w:lineRule="auto"/>
+        <w:jc w:val="both"/>
+        <w:rPr>
+          <w:b w:val="1"/>
+          <w:bCs w:val="1"/>
+          <w:sz w:val="36"/>
+          <w:szCs w:val="36"/>
+        </w:rPr>
+      </w:pPr>
+      <w:r>
+        <w:rPr>
+          <w:sz w:val="32"/>
+          <w:szCs w:val="32"/>
+          <w:rtl w:val="0"/>
+        </w:rPr>
+        <w:t xml:space="preserve">9.2 Recommendations</w:t>
       </w:r>
     </w:p>
     <w:p>
@@ -9241,13 +9789,13 @@
           <w:bCs w:val="1"/>
           <w:rtl w:val="0"/>
         </w:rPr>
-        <w:t xml:space="preserve">Target the Metal/Plastic and Cardboard/Paper confusions. </w:t>
-      </w:r>
-      <w:r>
-        <w:rPr>
-          <w:rtl w:val="0"/>
-        </w:rPr>
-        <w:t xml:space="preserve">Consider additional training images or augmentation that emphasizes the cues that distinguish these pairs (e.g., surface reflectance, texture) to close the gap to the 90% objective.</w:t>
+        <w:t xml:space="preserve">Close the generalization gap found by the external test. </w:t>
+      </w:r>
+      <w:r>
+        <w:rPr>
+          <w:rtl w:val="0"/>
+        </w:rPr>
+        <w:t xml:space="preserve">The 87.93%-to-65.0% drop on everyday photos (Section 6.5) is larger than the gap to the 90% RealWaste-test objective; add training images with varied backgrounds and cameras, or stronger augmentation, before relying on the model outside RealWaste's own conditions.</w:t>
       </w:r>
     </w:p>
     <w:p>
@@ -9267,6 +9815,32 @@
           <w:bCs w:val="1"/>
           <w:rtl w:val="0"/>
         </w:rPr>
+        <w:t xml:space="preserve">Target the Metal/Plastic and Cardboard/Paper confusions. </w:t>
+      </w:r>
+      <w:r>
+        <w:rPr>
+          <w:rtl w:val="0"/>
+        </w:rPr>
+        <w:t xml:space="preserve">Consider additional training images or augmentation that emphasizes the cues that distinguish these pairs (e.g., surface reflectance, texture) to close the gap to the 90% objective.</w:t>
+      </w:r>
+    </w:p>
+    <w:p>
+      <w:pPr>
+        <w:numPr>
+          <w:ilvl w:val="0"/>
+          <w:numId w:val="2"/>
+        </w:numPr>
+        <w:spacing w:after="240" w:before="240" w:line="240" w:lineRule="auto"/>
+        <w:ind w:left="720" w:hanging="360"/>
+        <w:jc w:val="both"/>
+        <w:rPr/>
+      </w:pPr>
+      <w:r>
+        <w:rPr>
+          <w:b w:val="1"/>
+          <w:bCs w:val="1"/>
+          <w:rtl w:val="0"/>
+        </w:rPr>
         <w:t xml:space="preserve">Planned for the Final project: robot integration. </w:t>
       </w:r>
       <w:r>
@@ -9704,6 +10278,62 @@
         <w:rPr>
           <w:rtl w:val="0"/>
         </w:rPr>
+      </w:r>
+    </w:p>
+    <w:p>
+      <w:pPr>
+        <w:spacing w:after="160" w:line="240" w:lineRule="auto"/>
+        <w:ind w:left="1440" w:hanging="720"/>
+        <w:jc w:val="both"/>
+        <w:rPr/>
+      </w:pPr>
+      <w:r>
+        <w:rPr>
+          <w:rtl w:val="0"/>
+        </w:rPr>
+        <w:t xml:space="preserve">Thung, G., &amp; Yang, M. (2017). </w:t>
+      </w:r>
+      <w:r>
+        <w:rPr>
+          <w:i w:val="1"/>
+          <w:iCs w:val="1"/>
+          <w:rtl w:val="0"/>
+        </w:rPr>
+        <w:t xml:space="preserve">TrashNet</w:t>
+      </w:r>
+      <w:r>
+        <w:rPr>
+          <w:rtl w:val="0"/>
+        </w:rPr>
+        <w:t xml:space="preserve"> [Data set]. GitHub. https://github.com/garythung/trashnet (MIT License)</w:t>
+      </w:r>
+    </w:p>
+    <w:p>
+      <w:pPr>
+        <w:spacing w:after="160" w:line="240" w:lineRule="auto"/>
+        <w:ind w:left="1440" w:hanging="720"/>
+        <w:jc w:val="both"/>
+        <w:rPr/>
+      </w:pPr>
+      <w:r>
+        <w:rPr>
+          <w:rtl w:val="0"/>
+        </w:rPr>
+        <w:t xml:space="preserve">Wikimedia Commons contributors. (n.d.). </w:t>
+      </w:r>
+      <w:r>
+        <w:rPr>
+          <w:i w:val="1"/>
+          <w:iCs w:val="1"/>
+          <w:rtl w:val="0"/>
+        </w:rPr>
+        <w:t xml:space="preserve">Wikimedia Commons</w:t>
+      </w:r>
+      <w:r>
+        <w:rPr>
+          <w:rtl w:val="0"/>
+        </w:rPr>
+        <w:t xml:space="preserve"> [Image collection]. Wikimedia Foundation. https://commons.wikimedia.org (per-image CC0/CC BY/CC BY-SA licenses; see external_test/SOURCES.csv for per-image attribution)</w:t>
       </w:r>
     </w:p>
     <w:p>

</xml_diff>

<commit_message>
Fix report heading alignment, keep-with-next, and arrow glyphs
- Left-align and keep-with-next all 44 numbered headings plus REFERENCES,
  removing the word-stretch on wrapped headings (e.g. section 8 and 9) and
  the orphaned 9.2 Recommendations heading.
- Replace arrow glyphs in worker-added text with plain words (e.g.
  Paper misread as Cardboard, SEE and RECOGNIZE, the SEE, DECIDE, and ACT
  loop), keeping arrows only in the two instances confirmed present in the
  captain's original (the 1.3 objective bullet and the OpenCV row BGR->RGB
  note).
</commit_message>
<xml_diff>
--- a/docs/Midterm - Computer Vision Project Report.docx
+++ b/docs/Midterm - Computer Vision Project Report.docx
@@ -463,8 +463,9 @@
     </w:p>
     <w:p>
       <w:pPr>
+        <w:keepNext/>
         <w:spacing w:after="160" w:line="278.00000000000006" w:lineRule="auto"/>
-        <w:jc w:val="both"/>
+        <w:jc w:val="left"/>
         <w:rPr>
           <w:b w:val="1"/>
           <w:bCs w:val="1"/>
@@ -485,8 +486,9 @@
     </w:p>
     <w:p>
       <w:pPr>
+        <w:keepNext/>
         <w:spacing w:after="160" w:line="278.00000000000006" w:lineRule="auto"/>
-        <w:jc w:val="both"/>
+        <w:jc w:val="left"/>
         <w:rPr>
           <w:sz w:val="32"/>
           <w:szCs w:val="32"/>
@@ -620,8 +622,9 @@
     </w:p>
     <w:p>
       <w:pPr>
+        <w:keepNext/>
         <w:spacing w:after="160" w:line="278.00000000000006" w:lineRule="auto"/>
-        <w:jc w:val="both"/>
+        <w:jc w:val="left"/>
         <w:rPr>
           <w:sz w:val="32"/>
           <w:szCs w:val="32"/>
@@ -692,8 +695,9 @@
     </w:p>
     <w:p>
       <w:pPr>
+        <w:keepNext/>
         <w:spacing w:after="160" w:line="278.00000000000006" w:lineRule="auto"/>
-        <w:jc w:val="both"/>
+        <w:jc w:val="left"/>
         <w:rPr>
           <w:sz w:val="32"/>
           <w:szCs w:val="32"/>
@@ -963,8 +967,9 @@
     </w:p>
     <w:p>
       <w:pPr>
+        <w:keepNext/>
         <w:spacing w:after="120" w:before="360" w:line="240" w:lineRule="auto"/>
-        <w:jc w:val="both"/>
+        <w:jc w:val="left"/>
         <w:rPr>
           <w:b w:val="1"/>
           <w:bCs w:val="1"/>
@@ -2477,8 +2482,9 @@
     </w:p>
     <w:p>
       <w:pPr>
+        <w:keepNext/>
         <w:spacing w:after="120" w:before="360" w:line="240" w:lineRule="auto"/>
-        <w:jc w:val="both"/>
+        <w:jc w:val="left"/>
         <w:rPr>
           <w:b w:val="1"/>
           <w:bCs w:val="1"/>
@@ -2535,8 +2541,9 @@
     </w:p>
     <w:p>
       <w:pPr>
+        <w:keepNext/>
         <w:spacing w:after="120" w:before="480" w:line="240" w:lineRule="auto"/>
-        <w:jc w:val="both"/>
+        <w:jc w:val="left"/>
         <w:rPr>
           <w:b w:val="1"/>
           <w:bCs w:val="1"/>
@@ -2562,8 +2569,9 @@
     </w:p>
     <w:p>
       <w:pPr>
+        <w:keepNext/>
         <w:spacing w:after="120" w:before="360" w:line="240" w:lineRule="auto"/>
-        <w:jc w:val="both"/>
+        <w:jc w:val="left"/>
         <w:rPr>
           <w:b w:val="1"/>
           <w:bCs w:val="1"/>
@@ -2676,8 +2684,9 @@
     </w:p>
     <w:p>
       <w:pPr>
+        <w:keepNext/>
         <w:spacing w:after="120" w:before="360" w:line="240" w:lineRule="auto"/>
-        <w:jc w:val="both"/>
+        <w:jc w:val="left"/>
         <w:rPr>
           <w:b w:val="1"/>
           <w:bCs w:val="1"/>
@@ -3071,8 +3080,9 @@
     </w:p>
     <w:p>
       <w:pPr>
+        <w:keepNext/>
         <w:spacing w:after="120" w:before="360" w:line="240" w:lineRule="auto"/>
-        <w:jc w:val="both"/>
+        <w:jc w:val="left"/>
         <w:rPr>
           <w:b w:val="1"/>
           <w:bCs w:val="1"/>
@@ -3617,8 +3627,9 @@
     </w:tbl>
     <w:p>
       <w:pPr>
+        <w:keepNext/>
         <w:spacing w:after="240" w:before="240" w:line="240" w:lineRule="auto"/>
-        <w:jc w:val="both"/>
+        <w:jc w:val="left"/>
         <w:rPr>
           <w:b w:val="1"/>
           <w:bCs w:val="1"/>
@@ -5022,8 +5033,9 @@
     </w:p>
     <w:p>
       <w:pPr>
+        <w:keepNext/>
         <w:spacing w:after="120" w:before="480" w:line="240" w:lineRule="auto"/>
-        <w:jc w:val="both"/>
+        <w:jc w:val="left"/>
         <w:rPr>
           <w:b w:val="1"/>
           <w:bCs w:val="1"/>
@@ -5044,8 +5056,9 @@
     </w:p>
     <w:p>
       <w:pPr>
+        <w:keepNext/>
         <w:spacing w:after="120" w:before="360" w:line="240" w:lineRule="auto"/>
-        <w:jc w:val="both"/>
+        <w:jc w:val="left"/>
         <w:rPr>
           <w:b w:val="1"/>
           <w:bCs w:val="1"/>
@@ -5077,8 +5090,9 @@
     </w:p>
     <w:p>
       <w:pPr>
+        <w:keepNext/>
         <w:spacing w:after="120" w:before="360" w:line="240" w:lineRule="auto"/>
-        <w:jc w:val="both"/>
+        <w:jc w:val="left"/>
         <w:rPr>
           <w:b w:val="1"/>
           <w:bCs w:val="1"/>
@@ -5899,8 +5913,9 @@
     </w:p>
     <w:p>
       <w:pPr>
+        <w:keepNext/>
         <w:spacing w:after="120" w:before="360" w:line="240" w:lineRule="auto"/>
-        <w:jc w:val="both"/>
+        <w:jc w:val="left"/>
         <w:rPr>
           <w:b w:val="1"/>
           <w:bCs w:val="1"/>
@@ -5932,8 +5947,9 @@
     </w:p>
     <w:p>
       <w:pPr>
+        <w:keepNext/>
         <w:spacing w:after="120" w:before="360" w:line="240" w:lineRule="auto"/>
-        <w:jc w:val="both"/>
+        <w:jc w:val="left"/>
         <w:rPr>
           <w:b w:val="1"/>
           <w:bCs w:val="1"/>
@@ -6024,8 +6040,9 @@
     </w:p>
     <w:p>
       <w:pPr>
+        <w:keepNext/>
         <w:spacing w:after="120" w:before="360" w:line="240" w:lineRule="auto"/>
-        <w:jc w:val="both"/>
+        <w:jc w:val="left"/>
         <w:rPr>
           <w:b w:val="1"/>
           <w:bCs w:val="1"/>
@@ -6135,8 +6152,9 @@
     </w:p>
     <w:p>
       <w:pPr>
+        <w:keepNext/>
         <w:spacing w:after="120" w:before="360" w:line="240" w:lineRule="auto"/>
-        <w:jc w:val="both"/>
+        <w:jc w:val="left"/>
         <w:rPr>
           <w:b w:val="1"/>
           <w:bCs w:val="1"/>
@@ -6227,8 +6245,9 @@
     </w:p>
     <w:p>
       <w:pPr>
+        <w:keepNext/>
         <w:spacing w:after="120" w:before="480" w:line="240" w:lineRule="auto"/>
-        <w:jc w:val="both"/>
+        <w:jc w:val="left"/>
         <w:rPr>
           <w:b w:val="1"/>
           <w:bCs w:val="1"/>
@@ -6249,8 +6268,9 @@
     </w:p>
     <w:p>
       <w:pPr>
+        <w:keepNext/>
         <w:spacing w:after="120" w:before="360" w:line="240" w:lineRule="auto"/>
-        <w:jc w:val="both"/>
+        <w:jc w:val="left"/>
         <w:rPr>
           <w:b w:val="1"/>
           <w:bCs w:val="1"/>
@@ -6282,8 +6302,9 @@
     </w:p>
     <w:p>
       <w:pPr>
+        <w:keepNext/>
         <w:spacing w:after="120" w:before="360" w:line="240" w:lineRule="auto"/>
-        <w:jc w:val="both"/>
+        <w:jc w:val="left"/>
         <w:rPr>
           <w:b w:val="1"/>
           <w:bCs w:val="1"/>
@@ -6315,8 +6336,9 @@
     </w:p>
     <w:p>
       <w:pPr>
+        <w:keepNext/>
         <w:spacing w:after="120" w:before="360" w:line="240" w:lineRule="auto"/>
-        <w:jc w:val="both"/>
+        <w:jc w:val="left"/>
         <w:rPr>
           <w:b w:val="1"/>
           <w:bCs w:val="1"/>
@@ -6426,8 +6448,9 @@
     </w:p>
     <w:p>
       <w:pPr>
+        <w:keepNext/>
         <w:spacing w:after="120" w:before="360" w:line="240" w:lineRule="auto"/>
-        <w:jc w:val="both"/>
+        <w:jc w:val="left"/>
         <w:rPr>
           <w:b w:val="1"/>
           <w:bCs w:val="1"/>
@@ -6905,8 +6928,9 @@
     </w:p>
     <w:p>
       <w:pPr>
+        <w:keepNext/>
         <w:spacing w:after="120" w:before="360" w:line="240" w:lineRule="auto"/>
-        <w:jc w:val="both"/>
+        <w:jc w:val="left"/>
         <w:rPr>
           <w:b w:val="1"/>
           <w:bCs w:val="1"/>
@@ -7144,7 +7168,7 @@
                 <w:b w:val="0"/>
                 <w:rtl w:val="0"/>
               </w:rPr>
-              <w:t>fixed order used for argmax → label</w:t>
+              <w:t>fixed order used for argmax to label</w:t>
             </w:r>
           </w:p>
         </w:tc>
@@ -7615,8 +7639,9 @@
     </w:p>
     <w:p>
       <w:pPr>
+        <w:keepNext/>
         <w:spacing w:after="120" w:before="360" w:line="240" w:lineRule="auto"/>
-        <w:jc w:val="both"/>
+        <w:jc w:val="left"/>
         <w:rPr>
           <w:b w:val="1"/>
           <w:bCs w:val="1"/>
@@ -7643,13 +7668,14 @@
         <w:rPr>
           <w:rtl w:val="0"/>
         </w:rPr>
-        <w:t xml:space="preserve">Camera Frame / Image → BGR→RGB conversion → resize to 224×224 (cv2.INTER_AREA) → model.predict() → take the class with the highest softmax probability → if that probability is ≥ 0.60, show the class label and confidence; otherwise show “Uncertain”, and draw the result as a colored border and text banner on the output image (Section 5.3).</w:t>
-      </w:r>
-    </w:p>
-    <w:p>
-      <w:pPr>
+        <w:t>Camera Frame / Image, then BGR to RGB conversion, then resize to 224×224 (cv2.INTER_AREA), then model.predict(), then take the class with the highest softmax probability; if that probability is ≥ 0.60, show the class label and confidence, otherwise show “Uncertain”, and draw the result as a colored border and text banner on the output image (Section 5.3).</w:t>
+      </w:r>
+    </w:p>
+    <w:p>
+      <w:pPr>
+        <w:keepNext/>
         <w:spacing w:after="120" w:before="480" w:line="240" w:lineRule="auto"/>
-        <w:jc w:val="both"/>
+        <w:jc w:val="left"/>
         <w:rPr>
           <w:b w:val="1"/>
           <w:bCs w:val="1"/>
@@ -7670,8 +7696,9 @@
     </w:p>
     <w:p>
       <w:pPr>
+        <w:keepNext/>
         <w:spacing w:after="120" w:before="360" w:line="240" w:lineRule="auto"/>
-        <w:jc w:val="both"/>
+        <w:jc w:val="left"/>
         <w:rPr>
           <w:b w:val="1"/>
           <w:bCs w:val="1"/>
@@ -7703,8 +7730,9 @@
     </w:p>
     <w:p>
       <w:pPr>
+        <w:keepNext/>
         <w:spacing w:after="120" w:before="360" w:line="240" w:lineRule="auto"/>
-        <w:jc w:val="both"/>
+        <w:jc w:val="left"/>
         <w:rPr>
           <w:b w:val="1"/>
           <w:bCs w:val="1"/>
@@ -7736,8 +7764,9 @@
     </w:p>
     <w:p>
       <w:pPr>
+        <w:keepNext/>
         <w:spacing w:after="120" w:before="360" w:line="240" w:lineRule="auto"/>
-        <w:jc w:val="both"/>
+        <w:jc w:val="left"/>
         <w:rPr>
           <w:b w:val="1"/>
           <w:bCs w:val="1"/>
@@ -7769,8 +7798,9 @@
     </w:p>
     <w:p>
       <w:pPr>
+        <w:keepNext/>
         <w:spacing w:after="120" w:before="480" w:line="240" w:lineRule="auto"/>
-        <w:jc w:val="both"/>
+        <w:jc w:val="left"/>
         <w:rPr>
           <w:b w:val="1"/>
           <w:bCs w:val="1"/>
@@ -7791,8 +7821,9 @@
     </w:p>
     <w:p>
       <w:pPr>
+        <w:keepNext/>
         <w:spacing w:after="120" w:before="360" w:line="240" w:lineRule="auto"/>
-        <w:jc w:val="both"/>
+        <w:jc w:val="left"/>
         <w:rPr>
           <w:b w:val="1"/>
           <w:bCs w:val="1"/>
@@ -7824,8 +7855,9 @@
     </w:p>
     <w:p>
       <w:pPr>
+        <w:keepNext/>
         <w:spacing w:after="120" w:before="360" w:line="240" w:lineRule="auto"/>
-        <w:jc w:val="both"/>
+        <w:jc w:val="left"/>
         <w:rPr>
           <w:b w:val="1"/>
           <w:bCs w:val="1"/>
@@ -7857,8 +7889,9 @@
     </w:p>
     <w:p>
       <w:pPr>
+        <w:keepNext/>
         <w:spacing w:after="120" w:before="360" w:line="240" w:lineRule="auto"/>
-        <w:jc w:val="both"/>
+        <w:jc w:val="left"/>
         <w:rPr>
           <w:b w:val="1"/>
           <w:bCs w:val="1"/>
@@ -8896,13 +8929,14 @@
         <w:rPr>
           <w:rtl w:val="0"/>
         </w:rPr>
-        <w:t xml:space="preserve">Most common mistakes (true → predicted : count): Metal → Plastic (9), Plastic → Glass (8), Plastic → Metal (8), Cardboard → Paper (7), Paper → Cardboard (3).</w:t>
-      </w:r>
-    </w:p>
-    <w:p>
-      <w:pPr>
+        <w:t>Most common mistakes (true class misread as predicted class, with count): Metal misread as Plastic (9), Plastic misread as Glass (8), Plastic misread as Metal (8), Cardboard misread as Paper (7), Paper misread as Cardboard (3).</w:t>
+      </w:r>
+    </w:p>
+    <w:p>
+      <w:pPr>
+        <w:keepNext/>
         <w:spacing w:after="120" w:before="360" w:line="240" w:lineRule="auto"/>
-        <w:jc w:val="both"/>
+        <w:jc w:val="left"/>
         <w:rPr>
           <w:b w:val="1"/>
           <w:bCs w:val="1"/>
@@ -8934,8 +8968,9 @@
     </w:p>
     <w:p>
       <w:pPr>
+        <w:keepNext/>
         <w:spacing w:after="120" w:before="360" w:line="240" w:lineRule="auto"/>
-        <w:jc w:val="both"/>
+        <w:jc w:val="left"/>
         <w:rPr>
           <w:b w:val="1"/>
           <w:bCs w:val="1"/>
@@ -9538,13 +9573,14 @@
         <w:rPr>
           <w:rtl w:val="0"/>
         </w:rPr>
-        <w:t xml:space="preserve">The drop from 87.93% to 65.0% is domain shift: RealWaste's training photos were all taken at one landfill facility's point of reception, while the external images are everyday, single-object photos from varied cameras and backgrounds, which the model was never trained on. The largest error is Paper→Cardboard (8 of 20 Paper images), and Plastic is confused with Glass in both directions (6 Plastic→Glass, 4 Glass→Plastic); Cardboard and Metal generalize best (80% each). Full source attribution and license details are kept alongside the test images rather than in this report.</w:t>
-      </w:r>
-    </w:p>
-    <w:p>
-      <w:pPr>
+        <w:t>The drop from 87.93% to 65.0% is domain shift: RealWaste's training photos were all taken at one landfill facility's point of reception, while the external images are everyday, single-object photos from varied cameras and backgrounds, which the model was never trained on. The largest error is Paper misread as Cardboard (8 of 20 Paper images), and Plastic is confused with Glass in both directions (6 Plastic misread as Glass, 4 Glass misread as Plastic); Cardboard and Metal generalize best (80% each). Full source attribution and license details are kept alongside the test images rather than in this report.</w:t>
+      </w:r>
+    </w:p>
+    <w:p>
+      <w:pPr>
+        <w:keepNext/>
         <w:spacing w:after="120" w:before="480" w:line="240" w:lineRule="auto"/>
-        <w:jc w:val="both"/>
+        <w:jc w:val="left"/>
         <w:rPr>
           <w:b w:val="1"/>
           <w:bCs w:val="1"/>
@@ -9565,8 +9601,9 @@
     </w:p>
     <w:p>
       <w:pPr>
+        <w:keepNext/>
         <w:spacing w:after="120" w:before="360" w:line="240" w:lineRule="auto"/>
-        <w:jc w:val="both"/>
+        <w:jc w:val="left"/>
         <w:rPr>
           <w:b w:val="1"/>
           <w:bCs w:val="1"/>
@@ -9598,8 +9635,9 @@
     </w:p>
     <w:p>
       <w:pPr>
+        <w:keepNext/>
         <w:spacing w:after="120" w:before="360" w:line="240" w:lineRule="auto"/>
-        <w:jc w:val="both"/>
+        <w:jc w:val="left"/>
         <w:rPr>
           <w:b w:val="1"/>
           <w:bCs w:val="1"/>
@@ -9631,8 +9669,9 @@
     </w:p>
     <w:p>
       <w:pPr>
+        <w:keepNext/>
         <w:spacing w:after="120" w:before="360" w:line="240" w:lineRule="auto"/>
-        <w:jc w:val="both"/>
+        <w:jc w:val="left"/>
         <w:rPr>
           <w:b w:val="1"/>
           <w:bCs w:val="1"/>
@@ -9659,13 +9698,14 @@
         <w:rPr>
           <w:rtl w:val="0"/>
         </w:rPr>
-        <w:t xml:space="preserve">On the RealWaste test set, the dominant failure mode is confusion between visually similar material classes (Metal→Plastic, Plastic↔Glass/Metal, Cardboard→Paper; Section 6.3), not random or unexplainable errors. On the external test set (Section 6.5), the same kind of confusion appears but is larger: Paper→Cardboard (8 of 20) is now the single biggest error cell, and Plastic↔Glass confusion (6 and 4 images respectively) again shows up in both directions. This points to the model leaning on texture and color cues (cardboard-like brown tones, glass-like transparency) that do not reliably separate these classes once the images come from a different camera and setting than RealWaste's own landfill photography.</w:t>
-      </w:r>
-    </w:p>
-    <w:p>
-      <w:pPr>
+        <w:t>On the RealWaste test set, the dominant failure mode is confusion between visually similar material classes (Metal and Plastic, Plastic and Glass/Metal, Cardboard and Paper; Section 6.3), not random or unexplainable errors. On the external test set (Section 6.5), the same kind of confusion appears but is larger: Paper misread as Cardboard (8 of 20) is now the single biggest error cell, and Plastic and Glass confusion (6 and 4 images respectively) again shows up in both directions. This points to the model leaning on texture and color cues (cardboard-like brown tones, glass-like transparency) that do not reliably separate these classes once the images come from a different camera and setting than RealWaste's own landfill photography.</w:t>
+      </w:r>
+    </w:p>
+    <w:p>
+      <w:pPr>
+        <w:keepNext/>
         <w:spacing w:after="120" w:before="480" w:line="240" w:lineRule="auto"/>
-        <w:jc w:val="both"/>
+        <w:jc w:val="left"/>
         <w:rPr>
           <w:b w:val="1"/>
           <w:bCs w:val="1"/>
@@ -9699,8 +9739,9 @@
     </w:p>
     <w:p>
       <w:pPr>
+        <w:keepNext/>
         <w:spacing w:after="120" w:before="480" w:line="240" w:lineRule="auto"/>
-        <w:jc w:val="both"/>
+        <w:jc w:val="left"/>
         <w:rPr>
           <w:b w:val="1"/>
           <w:bCs w:val="1"/>
@@ -9721,8 +9762,9 @@
     </w:p>
     <w:p>
       <w:pPr>
+        <w:keepNext/>
         <w:spacing w:after="120" w:before="360" w:line="240" w:lineRule="auto"/>
-        <w:jc w:val="both"/>
+        <w:jc w:val="left"/>
         <w:rPr>
           <w:b w:val="1"/>
           <w:bCs w:val="1"/>
@@ -9749,13 +9791,14 @@
         <w:rPr>
           <w:rtl w:val="0"/>
         </w:rPr>
-        <w:t xml:space="preserve">The group built and evaluated a 5-class waste-image classifier (Cardboard, Glass, Metal, Paper, Plastic) using MobileNetV2 transfer learning on the RealWaste dataset, satisfying the Midterm requirements for Specialization 8 (Object Sorting): at least 4 classes with at least 100 images each, a prepared train/validation/test split, image preprocessing and augmentation, a working CV model, and evaluation with accuracy metrics and a confusion matrix. The final test accuracy is 87.93% (macro F1 0.878), short of the group's internal 90% target but demonstrating a working SEE → RECOGNIZE pipeline with a visible label and confidence output.</w:t>
-      </w:r>
-    </w:p>
-    <w:p>
-      <w:pPr>
+        <w:t>The group built and evaluated a 5-class waste-image classifier (Cardboard, Glass, Metal, Paper, Plastic) using MobileNetV2 transfer learning on the RealWaste dataset, satisfying the Midterm requirements for Specialization 8 (Object Sorting): at least 4 classes with at least 100 images each, a prepared train/validation/test split, image preprocessing and augmentation, a working CV model, and evaluation with accuracy metrics and a confusion matrix. The final test accuracy is 87.93% (macro F1 0.878), short of the group's internal 90% target but demonstrating a working SEE and RECOGNIZE pipeline with a visible label and confidence output.</w:t>
+      </w:r>
+    </w:p>
+    <w:p>
+      <w:pPr>
+        <w:keepNext/>
         <w:spacing w:after="120" w:before="360" w:line="240" w:lineRule="auto"/>
-        <w:jc w:val="both"/>
+        <w:jc w:val="left"/>
         <w:rPr>
           <w:b w:val="1"/>
           <w:bCs w:val="1"/>
@@ -9847,13 +9890,14 @@
         <w:rPr>
           <w:rtl w:val="0"/>
         </w:rPr>
-        <w:t xml:space="preserve">The recognized class will feed a decision step that chooses a sorting destination, driving a 4WD chassis's motors through a motor driver to physically move the item (the SEE → DECIDE → ACT loop), to be demonstrated in the Test 1 (Figure-8 line tracking) and Test 2 (Object Sorting) evaluations. None of this is in scope for this Midterm submission.</w:t>
-      </w:r>
-    </w:p>
-    <w:p>
-      <w:pPr>
+        <w:t>The recognized class will feed a decision step that chooses a sorting destination, driving a 4WD chassis's motors through a motor driver to physically move the item (the SEE, DECIDE, and ACT loop), to be demonstrated in the Test 1 (Figure-8 line tracking) and Test 2 (Object Sorting) evaluations. None of this is in scope for this Midterm submission.</w:t>
+      </w:r>
+    </w:p>
+    <w:p>
+      <w:pPr>
+        <w:keepNext/>
         <w:spacing w:after="120" w:before="480" w:line="240" w:lineRule="auto"/>
-        <w:jc w:val="both"/>
+        <w:jc w:val="left"/>
         <w:rPr>
           <w:b w:val="1"/>
           <w:bCs w:val="1"/>

</xml_diff>

<commit_message>
Fix table borders and keep tables/figures with their captions
- Table 4 (Model Parameters and Configuration) was missing cell borders and
  margins on its last four rows (Pre-trained weights, Fine-tuned layers,
  Class weighting, Confidence threshold); copied the border/margin/vAlign
  properties from the fully-bordered rows above so the table is consistent.
- Added keep-with-next on the last row of every table and on every figure
  image paragraph that is immediately followed by a Table/Figure caption,
  so captions no longer separate from their table or figure across a page
  break.
</commit_message>
<xml_diff>
--- a/docs/Midterm - Computer Vision Project Report.docx
+++ b/docs/Midterm - Computer Vision Project Report.docx
@@ -2106,6 +2106,7 @@
           </w:tcPr>
           <w:p>
             <w:pPr>
+              <w:keepNext/>
               <w:widowControl w:val="0"/>
               <w:spacing w:after="40" w:before="40" w:line="240" w:lineRule="auto"/>
               <w:jc w:val="both"/>
@@ -2142,6 +2143,7 @@
           </w:tcPr>
           <w:p>
             <w:pPr>
+              <w:keepNext/>
               <w:widowControl w:val="0"/>
               <w:spacing w:after="40" w:before="40" w:line="240" w:lineRule="auto"/>
               <w:jc w:val="both"/>
@@ -2178,6 +2180,7 @@
           </w:tcPr>
           <w:p>
             <w:pPr>
+              <w:keepNext/>
               <w:widowControl w:val="0"/>
               <w:spacing w:after="40" w:before="40" w:line="240" w:lineRule="auto"/>
               <w:jc w:val="both"/>
@@ -2214,6 +2217,7 @@
           </w:tcPr>
           <w:p>
             <w:pPr>
+              <w:keepNext/>
               <w:widowControl w:val="0"/>
               <w:spacing w:after="40" w:before="40" w:line="240" w:lineRule="auto"/>
               <w:jc w:val="both"/>
@@ -2250,6 +2254,7 @@
           </w:tcPr>
           <w:p>
             <w:pPr>
+              <w:keepNext/>
               <w:widowControl w:val="0"/>
               <w:spacing w:after="40" w:before="40" w:line="240" w:lineRule="auto"/>
               <w:jc w:val="both"/>
@@ -2614,6 +2619,7 @@
     </w:p>
     <w:p>
       <w:pPr>
+        <w:keepNext/>
         <w:spacing w:after="240" w:before="240" w:line="240" w:lineRule="auto"/>
         <w:jc w:val="center"/>
         <w:rPr/>
@@ -5802,6 +5808,7 @@
           </w:tcPr>
           <w:p>
             <w:pPr>
+              <w:keepNext/>
               <w:widowControl w:val="0"/>
               <w:spacing w:after="40" w:before="40" w:line="240" w:lineRule="auto"/>
               <w:jc w:val="both"/>
@@ -5838,6 +5845,7 @@
           </w:tcPr>
           <w:p>
             <w:pPr>
+              <w:keepNext/>
               <w:widowControl w:val="0"/>
               <w:spacing w:after="40" w:before="40" w:line="240" w:lineRule="auto"/>
               <w:jc w:val="both"/>
@@ -5873,6 +5881,7 @@
           </w:tcPr>
           <w:p>
             <w:pPr>
+              <w:keepNext/>
               <w:widowControl w:val="0"/>
               <w:spacing w:after="40" w:before="40" w:line="240" w:lineRule="auto"/>
               <w:jc w:val="both"/>
@@ -5981,6 +5990,7 @@
     </w:p>
     <w:p>
       <w:pPr>
+        <w:keepNext/>
         <w:spacing w:after="240" w:before="240" w:line="240" w:lineRule="auto"/>
         <w:jc w:val="center"/>
         <w:rPr/>
@@ -6186,6 +6196,7 @@
     </w:p>
     <w:p>
       <w:pPr>
+        <w:keepNext/>
         <w:spacing w:after="240" w:before="240" w:line="240" w:lineRule="auto"/>
         <w:jc w:val="center"/>
         <w:rPr/>
@@ -6795,6 +6806,7 @@
           </w:tcPr>
           <w:p>
             <w:pPr>
+              <w:keepNext/>
               <w:rPr/>
             </w:pPr>
             <w:r>
@@ -6824,6 +6836,7 @@
           </w:tcPr>
           <w:p>
             <w:pPr>
+              <w:keepNext/>
               <w:rPr/>
             </w:pPr>
             <w:r>
@@ -6853,6 +6866,7 @@
           </w:tcPr>
           <w:p>
             <w:pPr>
+              <w:keepNext/>
               <w:rPr/>
             </w:pPr>
             <w:r>
@@ -6882,6 +6896,7 @@
           </w:tcPr>
           <w:p>
             <w:pPr>
+              <w:keepNext/>
               <w:rPr/>
             </w:pPr>
             <w:r>
@@ -7455,9 +7470,27 @@
         </w:tc>
       </w:tr>
       <w:tr>
+        <w:trPr>
+          <w:cantSplit w:val="0"/>
+          <w:trHeight w:val="20" w:hRule="atLeast"/>
+          <w:tblHeader w:val="0"/>
+        </w:trPr>
         <w:tc>
           <w:tcPr>
             <w:tcW w:type="dxa" w:w="1935"/>
+            <w:tcBorders>
+              <w:top w:color="000000" w:space="0" w:sz="0" w:val="nil"/>
+              <w:left w:color="000000" w:space="0" w:sz="7" w:val="single"/>
+              <w:bottom w:color="000000" w:space="0" w:sz="7" w:val="single"/>
+              <w:right w:color="000000" w:space="0" w:sz="7" w:val="single"/>
+            </w:tcBorders>
+            <w:tcMar>
+              <w:top w:w="100.0" w:type="dxa"/>
+              <w:left w:w="100.0" w:type="dxa"/>
+              <w:bottom w:w="100.0" w:type="dxa"/>
+              <w:right w:w="100.0" w:type="dxa"/>
+            </w:tcMar>
+            <w:vAlign w:val="top"/>
           </w:tcPr>
           <w:p>
             <w:r>
@@ -7471,6 +7504,19 @@
         <w:tc>
           <w:tcPr>
             <w:tcW w:type="dxa" w:w="3615"/>
+            <w:tcBorders>
+              <w:top w:color="000000" w:space="0" w:sz="0" w:val="nil"/>
+              <w:left w:color="000000" w:space="0" w:sz="0" w:val="nil"/>
+              <w:bottom w:color="000000" w:space="0" w:sz="7" w:val="single"/>
+              <w:right w:color="000000" w:space="0" w:sz="7" w:val="single"/>
+            </w:tcBorders>
+            <w:tcMar>
+              <w:top w:w="100.0" w:type="dxa"/>
+              <w:left w:w="100.0" w:type="dxa"/>
+              <w:bottom w:w="100.0" w:type="dxa"/>
+              <w:right w:w="100.0" w:type="dxa"/>
+            </w:tcMar>
+            <w:vAlign w:val="top"/>
           </w:tcPr>
           <w:p>
             <w:r>
@@ -7484,6 +7530,19 @@
         <w:tc>
           <w:tcPr>
             <w:tcW w:type="dxa" w:w="4245"/>
+            <w:tcBorders>
+              <w:top w:color="000000" w:space="0" w:sz="0" w:val="nil"/>
+              <w:left w:color="000000" w:space="0" w:sz="0" w:val="nil"/>
+              <w:bottom w:color="000000" w:space="0" w:sz="7" w:val="single"/>
+              <w:right w:color="000000" w:space="0" w:sz="7" w:val="single"/>
+            </w:tcBorders>
+            <w:tcMar>
+              <w:top w:w="100.0" w:type="dxa"/>
+              <w:left w:w="100.0" w:type="dxa"/>
+              <w:bottom w:w="100.0" w:type="dxa"/>
+              <w:right w:w="100.0" w:type="dxa"/>
+            </w:tcMar>
+            <w:vAlign w:val="top"/>
           </w:tcPr>
           <w:p>
             <w:r>
@@ -7496,9 +7555,27 @@
         </w:tc>
       </w:tr>
       <w:tr>
+        <w:trPr>
+          <w:cantSplit w:val="0"/>
+          <w:trHeight w:val="20" w:hRule="atLeast"/>
+          <w:tblHeader w:val="0"/>
+        </w:trPr>
         <w:tc>
           <w:tcPr>
             <w:tcW w:type="dxa" w:w="1935"/>
+            <w:tcBorders>
+              <w:top w:color="000000" w:space="0" w:sz="0" w:val="nil"/>
+              <w:left w:color="000000" w:space="0" w:sz="7" w:val="single"/>
+              <w:bottom w:color="000000" w:space="0" w:sz="7" w:val="single"/>
+              <w:right w:color="000000" w:space="0" w:sz="7" w:val="single"/>
+            </w:tcBorders>
+            <w:tcMar>
+              <w:top w:w="100.0" w:type="dxa"/>
+              <w:left w:w="100.0" w:type="dxa"/>
+              <w:bottom w:w="100.0" w:type="dxa"/>
+              <w:right w:w="100.0" w:type="dxa"/>
+            </w:tcMar>
+            <w:vAlign w:val="top"/>
           </w:tcPr>
           <w:p>
             <w:r>
@@ -7512,6 +7589,19 @@
         <w:tc>
           <w:tcPr>
             <w:tcW w:type="dxa" w:w="3615"/>
+            <w:tcBorders>
+              <w:top w:color="000000" w:space="0" w:sz="0" w:val="nil"/>
+              <w:left w:color="000000" w:space="0" w:sz="0" w:val="nil"/>
+              <w:bottom w:color="000000" w:space="0" w:sz="7" w:val="single"/>
+              <w:right w:color="000000" w:space="0" w:sz="7" w:val="single"/>
+            </w:tcBorders>
+            <w:tcMar>
+              <w:top w:w="100.0" w:type="dxa"/>
+              <w:left w:w="100.0" w:type="dxa"/>
+              <w:bottom w:w="100.0" w:type="dxa"/>
+              <w:right w:w="100.0" w:type="dxa"/>
+            </w:tcMar>
+            <w:vAlign w:val="top"/>
           </w:tcPr>
           <w:p>
             <w:r>
@@ -7525,6 +7615,19 @@
         <w:tc>
           <w:tcPr>
             <w:tcW w:type="dxa" w:w="4245"/>
+            <w:tcBorders>
+              <w:top w:color="000000" w:space="0" w:sz="0" w:val="nil"/>
+              <w:left w:color="000000" w:space="0" w:sz="0" w:val="nil"/>
+              <w:bottom w:color="000000" w:space="0" w:sz="7" w:val="single"/>
+              <w:right w:color="000000" w:space="0" w:sz="7" w:val="single"/>
+            </w:tcBorders>
+            <w:tcMar>
+              <w:top w:w="100.0" w:type="dxa"/>
+              <w:left w:w="100.0" w:type="dxa"/>
+              <w:bottom w:w="100.0" w:type="dxa"/>
+              <w:right w:w="100.0" w:type="dxa"/>
+            </w:tcMar>
+            <w:vAlign w:val="top"/>
           </w:tcPr>
           <w:p>
             <w:r>
@@ -7537,9 +7640,27 @@
         </w:tc>
       </w:tr>
       <w:tr>
+        <w:trPr>
+          <w:cantSplit w:val="0"/>
+          <w:trHeight w:val="20" w:hRule="atLeast"/>
+          <w:tblHeader w:val="0"/>
+        </w:trPr>
         <w:tc>
           <w:tcPr>
             <w:tcW w:type="dxa" w:w="1935"/>
+            <w:tcBorders>
+              <w:top w:color="000000" w:space="0" w:sz="0" w:val="nil"/>
+              <w:left w:color="000000" w:space="0" w:sz="7" w:val="single"/>
+              <w:bottom w:color="000000" w:space="0" w:sz="7" w:val="single"/>
+              <w:right w:color="000000" w:space="0" w:sz="7" w:val="single"/>
+            </w:tcBorders>
+            <w:tcMar>
+              <w:top w:w="100.0" w:type="dxa"/>
+              <w:left w:w="100.0" w:type="dxa"/>
+              <w:bottom w:w="100.0" w:type="dxa"/>
+              <w:right w:w="100.0" w:type="dxa"/>
+            </w:tcMar>
+            <w:vAlign w:val="top"/>
           </w:tcPr>
           <w:p>
             <w:r>
@@ -7553,6 +7674,19 @@
         <w:tc>
           <w:tcPr>
             <w:tcW w:type="dxa" w:w="3615"/>
+            <w:tcBorders>
+              <w:top w:color="000000" w:space="0" w:sz="0" w:val="nil"/>
+              <w:left w:color="000000" w:space="0" w:sz="0" w:val="nil"/>
+              <w:bottom w:color="000000" w:space="0" w:sz="7" w:val="single"/>
+              <w:right w:color="000000" w:space="0" w:sz="7" w:val="single"/>
+            </w:tcBorders>
+            <w:tcMar>
+              <w:top w:w="100.0" w:type="dxa"/>
+              <w:left w:w="100.0" w:type="dxa"/>
+              <w:bottom w:w="100.0" w:type="dxa"/>
+              <w:right w:w="100.0" w:type="dxa"/>
+            </w:tcMar>
+            <w:vAlign w:val="top"/>
           </w:tcPr>
           <w:p>
             <w:r>
@@ -7566,6 +7700,19 @@
         <w:tc>
           <w:tcPr>
             <w:tcW w:type="dxa" w:w="4245"/>
+            <w:tcBorders>
+              <w:top w:color="000000" w:space="0" w:sz="0" w:val="nil"/>
+              <w:left w:color="000000" w:space="0" w:sz="0" w:val="nil"/>
+              <w:bottom w:color="000000" w:space="0" w:sz="7" w:val="single"/>
+              <w:right w:color="000000" w:space="0" w:sz="7" w:val="single"/>
+            </w:tcBorders>
+            <w:tcMar>
+              <w:top w:w="100.0" w:type="dxa"/>
+              <w:left w:w="100.0" w:type="dxa"/>
+              <w:bottom w:w="100.0" w:type="dxa"/>
+              <w:right w:w="100.0" w:type="dxa"/>
+            </w:tcMar>
+            <w:vAlign w:val="top"/>
           </w:tcPr>
           <w:p>
             <w:r>
@@ -7578,11 +7725,32 @@
         </w:tc>
       </w:tr>
       <w:tr>
+        <w:trPr>
+          <w:cantSplit w:val="0"/>
+          <w:trHeight w:val="20" w:hRule="atLeast"/>
+          <w:tblHeader w:val="0"/>
+        </w:trPr>
         <w:tc>
           <w:tcPr>
             <w:tcW w:type="dxa" w:w="1935"/>
-          </w:tcPr>
-          <w:p>
+            <w:tcBorders>
+              <w:top w:color="000000" w:space="0" w:sz="0" w:val="nil"/>
+              <w:left w:color="000000" w:space="0" w:sz="7" w:val="single"/>
+              <w:bottom w:color="000000" w:space="0" w:sz="7" w:val="single"/>
+              <w:right w:color="000000" w:space="0" w:sz="7" w:val="single"/>
+            </w:tcBorders>
+            <w:tcMar>
+              <w:top w:w="100.0" w:type="dxa"/>
+              <w:left w:w="100.0" w:type="dxa"/>
+              <w:bottom w:w="100.0" w:type="dxa"/>
+              <w:right w:w="100.0" w:type="dxa"/>
+            </w:tcMar>
+            <w:vAlign w:val="top"/>
+          </w:tcPr>
+          <w:p>
+            <w:pPr>
+              <w:keepNext/>
+            </w:pPr>
             <w:r>
               <w:rPr>
                 <w:b w:val="0"/>
@@ -7594,8 +7762,24 @@
         <w:tc>
           <w:tcPr>
             <w:tcW w:type="dxa" w:w="3615"/>
-          </w:tcPr>
-          <w:p>
+            <w:tcBorders>
+              <w:top w:color="000000" w:space="0" w:sz="0" w:val="nil"/>
+              <w:left w:color="000000" w:space="0" w:sz="0" w:val="nil"/>
+              <w:bottom w:color="000000" w:space="0" w:sz="7" w:val="single"/>
+              <w:right w:color="000000" w:space="0" w:sz="7" w:val="single"/>
+            </w:tcBorders>
+            <w:tcMar>
+              <w:top w:w="100.0" w:type="dxa"/>
+              <w:left w:w="100.0" w:type="dxa"/>
+              <w:bottom w:w="100.0" w:type="dxa"/>
+              <w:right w:w="100.0" w:type="dxa"/>
+            </w:tcMar>
+            <w:vAlign w:val="top"/>
+          </w:tcPr>
+          <w:p>
+            <w:pPr>
+              <w:keepNext/>
+            </w:pPr>
             <w:r>
               <w:rPr>
                 <w:b w:val="0"/>
@@ -7607,8 +7791,24 @@
         <w:tc>
           <w:tcPr>
             <w:tcW w:type="dxa" w:w="4245"/>
-          </w:tcPr>
-          <w:p>
+            <w:tcBorders>
+              <w:top w:color="000000" w:space="0" w:sz="0" w:val="nil"/>
+              <w:left w:color="000000" w:space="0" w:sz="0" w:val="nil"/>
+              <w:bottom w:color="000000" w:space="0" w:sz="7" w:val="single"/>
+              <w:right w:color="000000" w:space="0" w:sz="7" w:val="single"/>
+            </w:tcBorders>
+            <w:tcMar>
+              <w:top w:w="100.0" w:type="dxa"/>
+              <w:left w:w="100.0" w:type="dxa"/>
+              <w:bottom w:w="100.0" w:type="dxa"/>
+              <w:right w:w="100.0" w:type="dxa"/>
+            </w:tcMar>
+            <w:vAlign w:val="top"/>
+          </w:tcPr>
+          <w:p>
+            <w:pPr>
+              <w:keepNext/>
+            </w:pPr>
             <w:r>
               <w:rPr>
                 <w:b w:val="0"/>
@@ -8717,6 +8917,7 @@
           </w:tcPr>
           <w:p>
             <w:pPr>
+              <w:keepNext/>
               <w:widowControl w:val="0"/>
               <w:spacing w:after="40" w:before="40" w:line="240" w:lineRule="auto"/>
               <w:jc w:val="both"/>
@@ -8749,6 +8950,7 @@
           </w:tcPr>
           <w:p>
             <w:pPr>
+              <w:keepNext/>
               <w:widowControl w:val="0"/>
               <w:spacing w:after="40" w:before="40" w:line="240" w:lineRule="auto"/>
               <w:jc w:val="both"/>
@@ -8781,6 +8983,7 @@
           </w:tcPr>
           <w:p>
             <w:pPr>
+              <w:keepNext/>
               <w:widowControl w:val="0"/>
               <w:spacing w:after="40" w:before="40" w:line="240" w:lineRule="auto"/>
               <w:jc w:val="both"/>
@@ -8813,6 +9016,7 @@
           </w:tcPr>
           <w:p>
             <w:pPr>
+              <w:keepNext/>
               <w:widowControl w:val="0"/>
               <w:spacing w:after="40" w:before="40" w:line="240" w:lineRule="auto"/>
               <w:jc w:val="both"/>
@@ -8862,6 +9066,7 @@
     </w:p>
     <w:p>
       <w:pPr>
+        <w:keepNext/>
         <w:spacing w:after="240" w:before="240" w:line="240" w:lineRule="auto"/>
         <w:jc w:val="center"/>
         <w:rPr/>
@@ -9438,6 +9643,7 @@
           </w:tcPr>
           <w:p>
             <w:pPr>
+              <w:keepNext/>
               <w:widowControl w:val="0"/>
               <w:spacing w:after="40" w:before="40" w:line="240" w:lineRule="auto"/>
               <w:jc w:val="both"/>
@@ -9470,6 +9676,7 @@
           </w:tcPr>
           <w:p>
             <w:pPr>
+              <w:keepNext/>
               <w:widowControl w:val="0"/>
               <w:spacing w:after="40" w:before="40" w:line="240" w:lineRule="auto"/>
               <w:jc w:val="both"/>
@@ -9506,6 +9713,7 @@
     </w:p>
     <w:p>
       <w:pPr>
+        <w:keepNext/>
         <w:spacing w:after="240" w:before="240" w:line="240" w:lineRule="auto"/>
         <w:jc w:val="center"/>
         <w:rPr/>

</xml_diff>

<commit_message>
Fix remaining arrow glyph and stretched Deng reference line
- Software table: the OpenCV row still used the original arrow glyph
  (BGR->RGB); changed to words per the captain's follow-up.
- References: the Deng et al. (2009) entry has a stretched justified line
  in the captain's original document itself, not only in the worker draft;
  left-aligned just that one entry so the stretch is gone while every other
  reference keeps the original's justified style.
</commit_message>
<xml_diff>
--- a/docs/Midterm - Computer Vision Project Report.docx
+++ b/docs/Midterm - Computer Vision Project Report.docx
@@ -4315,7 +4315,7 @@
               <w:rPr>
                 <w:rtl w:val="0"/>
               </w:rPr>
-              <w:t xml:space="preserve">Reads images, converts BGR→RGB, resizes for the demo, and draws the label, confidence and box on the output image. Also supports webcam frames via </w:t>
+              <w:t xml:space="preserve">Reads images, converts BGR to RGB, resizes for the demo, and draws the label, confidence and box on the output image. Also supports webcam frames via </w:t>
             </w:r>
             <w:r>
               <w:rPr>
@@ -10246,7 +10246,7 @@
       <w:pPr>
         <w:spacing w:after="160" w:line="240" w:lineRule="auto"/>
         <w:ind w:left="1440" w:hanging="720"/>
-        <w:jc w:val="both"/>
+        <w:jc w:val="left"/>
         <w:rPr/>
       </w:pPr>
       <w:r>

</xml_diff>

<commit_message>
Fix page-break widows: stray spacer paragraph and orphaned table headers
- Removed a stray empty paragraph (heading-sized formatting, no text) that
  sat between the 2.4 table and the 3. DATASET heading, the only heading in
  the document with this extra gap; spacing before 3. DATASET now matches
  every other major section heading.
- Added keep-with-next on every table's header row so a header row can no
  longer end up alone at the bottom of a page with its body rows pushed to
  the next page (seen on Table 2, Target Classes / Categories, after the
  spacer-paragraph fix shifted pagination).
</commit_message>
<xml_diff>
--- a/docs/Midterm - Computer Vision Project Report.docx
+++ b/docs/Midterm - Computer Vision Project Report.docx
@@ -1111,6 +1111,7 @@
           </w:tcPr>
           <w:p>
             <w:pPr>
+              <w:keepNext/>
               <w:widowControl w:val="0"/>
               <w:spacing w:after="40" w:before="40" w:line="240" w:lineRule="auto"/>
               <w:jc w:val="both"/>
@@ -1148,6 +1149,7 @@
           </w:tcPr>
           <w:p>
             <w:pPr>
+              <w:keepNext/>
               <w:widowControl w:val="0"/>
               <w:spacing w:after="40" w:before="40" w:line="240" w:lineRule="auto"/>
               <w:jc w:val="both"/>
@@ -1185,6 +1187,7 @@
           </w:tcPr>
           <w:p>
             <w:pPr>
+              <w:keepNext/>
               <w:widowControl w:val="0"/>
               <w:spacing w:after="40" w:before="40" w:line="240" w:lineRule="auto"/>
               <w:jc w:val="both"/>
@@ -1222,6 +1225,7 @@
           </w:tcPr>
           <w:p>
             <w:pPr>
+              <w:keepNext/>
               <w:widowControl w:val="0"/>
               <w:spacing w:after="40" w:before="40" w:line="240" w:lineRule="auto"/>
               <w:jc w:val="both"/>
@@ -1259,6 +1263,7 @@
           </w:tcPr>
           <w:p>
             <w:pPr>
+              <w:keepNext/>
               <w:widowControl w:val="0"/>
               <w:spacing w:after="40" w:before="40" w:line="240" w:lineRule="auto"/>
               <w:jc w:val="both"/>
@@ -3179,6 +3184,7 @@
           </w:tcPr>
           <w:p>
             <w:pPr>
+              <w:keepNext/>
               <w:jc w:val="both"/>
               <w:rPr>
                 <w:b w:val="1"/>
@@ -3214,6 +3220,7 @@
           </w:tcPr>
           <w:p>
             <w:pPr>
+              <w:keepNext/>
               <w:jc w:val="both"/>
               <w:rPr>
                 <w:b w:val="1"/>
@@ -3249,6 +3256,7 @@
           </w:tcPr>
           <w:p>
             <w:pPr>
+              <w:keepNext/>
               <w:jc w:val="both"/>
               <w:rPr>
                 <w:b w:val="1"/>
@@ -3720,6 +3728,7 @@
           </w:tcPr>
           <w:p>
             <w:pPr>
+              <w:keepNext/>
               <w:jc w:val="both"/>
               <w:rPr>
                 <w:b w:val="1"/>
@@ -3755,6 +3764,7 @@
           </w:tcPr>
           <w:p>
             <w:pPr>
+              <w:keepNext/>
               <w:jc w:val="both"/>
               <w:rPr>
                 <w:b w:val="1"/>
@@ -3790,6 +3800,7 @@
           </w:tcPr>
           <w:p>
             <w:pPr>
+              <w:keepNext/>
               <w:jc w:val="both"/>
               <w:rPr>
                 <w:b w:val="1"/>
@@ -5020,23 +5031,6 @@
         </w:tc>
       </w:tr>
     </w:tbl>
-    <w:p>
-      <w:pPr>
-        <w:spacing w:after="120" w:before="480" w:line="240" w:lineRule="auto"/>
-        <w:jc w:val="both"/>
-        <w:rPr>
-          <w:b w:val="1"/>
-          <w:bCs w:val="1"/>
-          <w:sz w:val="46"/>
-          <w:szCs w:val="46"/>
-        </w:rPr>
-      </w:pPr>
-      <w:r>
-        <w:rPr>
-          <w:rtl w:val="0"/>
-        </w:rPr>
-      </w:r>
-    </w:p>
     <w:p>
       <w:pPr>
         <w:keepNext/>
@@ -5182,6 +5176,7 @@
           </w:tcPr>
           <w:p>
             <w:pPr>
+              <w:keepNext/>
               <w:widowControl w:val="0"/>
               <w:spacing w:after="40" w:before="40" w:line="240" w:lineRule="auto"/>
               <w:jc w:val="both"/>
@@ -5219,6 +5214,7 @@
           </w:tcPr>
           <w:p>
             <w:pPr>
+              <w:keepNext/>
               <w:widowControl w:val="0"/>
               <w:spacing w:after="40" w:before="40" w:line="240" w:lineRule="auto"/>
               <w:jc w:val="both"/>
@@ -5256,6 +5252,7 @@
           </w:tcPr>
           <w:p>
             <w:pPr>
+              <w:keepNext/>
               <w:widowControl w:val="0"/>
               <w:spacing w:after="40" w:before="40" w:line="240" w:lineRule="auto"/>
               <w:jc w:val="both"/>
@@ -6537,6 +6534,7 @@
           </w:tcPr>
           <w:p>
             <w:pPr>
+              <w:keepNext/>
               <w:jc w:val="both"/>
               <w:rPr>
                 <w:b w:val="1"/>
@@ -6572,6 +6570,7 @@
           </w:tcPr>
           <w:p>
             <w:pPr>
+              <w:keepNext/>
               <w:jc w:val="both"/>
               <w:rPr>
                 <w:b w:val="1"/>
@@ -6607,6 +6606,7 @@
           </w:tcPr>
           <w:p>
             <w:pPr>
+              <w:keepNext/>
               <w:jc w:val="both"/>
               <w:rPr>
                 <w:b w:val="1"/>
@@ -6642,6 +6642,7 @@
           </w:tcPr>
           <w:p>
             <w:pPr>
+              <w:keepNext/>
               <w:jc w:val="both"/>
               <w:rPr>
                 <w:b w:val="1"/>
@@ -7007,6 +7008,7 @@
           </w:tcPr>
           <w:p>
             <w:pPr>
+              <w:keepNext/>
               <w:jc w:val="both"/>
               <w:rPr>
                 <w:b w:val="1"/>
@@ -7042,6 +7044,7 @@
           </w:tcPr>
           <w:p>
             <w:pPr>
+              <w:keepNext/>
               <w:jc w:val="both"/>
               <w:rPr>
                 <w:b w:val="1"/>
@@ -7077,6 +7080,7 @@
           </w:tcPr>
           <w:p>
             <w:pPr>
+              <w:keepNext/>
               <w:jc w:val="both"/>
               <w:rPr>
                 <w:b w:val="1"/>
@@ -8228,6 +8232,7 @@
           </w:tcPr>
           <w:p>
             <w:pPr>
+              <w:keepNext/>
               <w:widowControl w:val="0"/>
               <w:spacing w:after="40" w:before="40" w:line="240" w:lineRule="auto"/>
               <w:jc w:val="both"/>
@@ -8265,6 +8270,7 @@
           </w:tcPr>
           <w:p>
             <w:pPr>
+              <w:keepNext/>
               <w:widowControl w:val="0"/>
               <w:spacing w:after="40" w:before="40" w:line="240" w:lineRule="auto"/>
               <w:jc w:val="both"/>
@@ -8302,6 +8308,7 @@
           </w:tcPr>
           <w:p>
             <w:pPr>
+              <w:keepNext/>
               <w:widowControl w:val="0"/>
               <w:spacing w:after="40" w:before="40" w:line="240" w:lineRule="auto"/>
               <w:jc w:val="both"/>
@@ -8339,6 +8346,7 @@
           </w:tcPr>
           <w:p>
             <w:pPr>
+              <w:keepNext/>
               <w:widowControl w:val="0"/>
               <w:spacing w:after="40" w:before="40" w:line="240" w:lineRule="auto"/>
               <w:jc w:val="both"/>
@@ -9284,6 +9292,7 @@
           </w:tcPr>
           <w:p>
             <w:pPr>
+              <w:keepNext/>
               <w:widowControl w:val="0"/>
               <w:spacing w:after="40" w:before="40" w:line="240" w:lineRule="auto"/>
               <w:jc w:val="both"/>
@@ -9321,6 +9330,7 @@
           </w:tcPr>
           <w:p>
             <w:pPr>
+              <w:keepNext/>
               <w:widowControl w:val="0"/>
               <w:spacing w:after="40" w:before="40" w:line="240" w:lineRule="auto"/>
               <w:jc w:val="both"/>

</xml_diff>

<commit_message>
Add GitHub repo link to report cover, fix threshold wording, left-align stretched reference
- Cover page: GitHub repository link added directly under the notebook link,
  same style; also mentioned once in 5.1.
- 4.5 table, 4.6, and 5.3 updated from the hand-picked 0.60 to per-class
  thresholds (global fallback 0.59), pointing at the new Table 5.
- References: left-aligned the Thung & Yang entry (was justified, causing a
  stretched line), matching the earlier Deng fix.
- PDF regenerated and visually checked (cover, 4.5/4.6/5.3 page, References
  page); fonts still Liberation Sans only, matching the current PDF exactly.
</commit_message>
<xml_diff>
--- a/docs/Midterm - Computer Vision Project Report.docx
+++ b/docs/Midterm - Computer Vision Project Report.docx
@@ -376,6 +376,33 @@
             <w:rtl w:val="0"/>
           </w:rPr>
           <w:t xml:space="preserve">Midterm_Object_Sorting_RealWaste.ipynb</w:t>
+        </w:r>
+      </w:hyperlink>
+      <w:r>
+        <w:rPr>
+          <w:rtl w:val="0"/>
+        </w:rPr>
+      </w:r>
+    </w:p>
+    <w:p w14:paraId="00000012b">
+      <w:pPr>
+        <w:spacing w:after="160" w:line="278.00000000000006" w:lineRule="auto"/>
+        <w:jc w:val="center"/>
+        <w:rPr>
+          <w:sz w:val="24"/>
+          <w:szCs w:val="24"/>
+        </w:rPr>
+      </w:pPr>
+      <w:hyperlink r:id="rId13">
+        <w:r>
+          <w:rPr>
+            <w:color w:val="0000ee"/>
+            <w:sz w:val="24"/>
+            <w:szCs w:val="24"/>
+            <w:u w:val="single"/>
+            <w:rtl w:val="0"/>
+          </w:rPr>
+          <w:t xml:space="preserve">GitHub repository: https://github.com/J4ve/cv-object-sorting</w:t>
         </w:r>
       </w:hyperlink>
       <w:r>
@@ -7788,7 +7815,7 @@
               <w:rPr>
                 <w:b w:val="0"/>
               </w:rPr>
-              <w:t>0.60</w:t>
+              <w:t>per-class (0.52-0.64); global fallback 0.59</w:t>
             </w:r>
           </w:p>
         </w:tc>
@@ -7817,7 +7844,7 @@
               <w:rPr>
                 <w:b w:val="0"/>
               </w:rPr>
-              <w:t>predictions below this are shown as “Uncertain”</w:t>
+              <w:t>selected on the validation set, not hand-picked; see Table 5 and Section 4.6</w:t>
             </w:r>
           </w:p>
         </w:tc>
@@ -7872,7 +7899,7 @@
         <w:rPr>
           <w:rtl w:val="0"/>
         </w:rPr>
-        <w:t>Camera Frame / Image, then BGR to RGB conversion, then resize to 224×224 (cv2.INTER_AREA), then model.predict(), then take the class with the highest softmax probability; if that probability is ≥ 0.60, show the class label and confidence, otherwise show “Uncertain”, and draw the result as a colored border and text banner on the output image (Section 5.3).</w:t>
+        <w:t>Camera Frame / Image, then BGR to RGB conversion, then resize to 224×224 (cv2.INTER_AREA), then model.predict(), then take the class with the highest softmax probability; if that probability is ≥ the predicted class's own confidence threshold (Table 5), show the class label and confidence, otherwise show “Uncertain”, and draw the result as a colored border and text banner on the output image (Section 5.3).</w:t>
       </w:r>
     </w:p>
     <w:p>
@@ -7929,7 +7956,7 @@
         <w:rPr>
           <w:rtl w:val="0"/>
         </w:rPr>
-        <w:t xml:space="preserve">The demonstration pipeline is implemented as a single recognize(source, show=True) function in the notebook (Step 7). It accepts either an image file path or a BGR NumPy array (e.g. a camera frame), applies the Section 4.6 pipeline, and returns the predicted label, its confidence, and a copy of the input image annotated with the result. This keeps the training pipeline (tf.data, Section 3–4) and the single-image demo pipeline (OpenCV) using the same trained model and the same class order, so predictions from either path are directly comparable (see Section 4.2 for the one implementation difference between them).</w:t>
+        <w:t>The demonstration pipeline is implemented as a single recognize(source, show=True) function in the notebook (Step 7). It accepts either an image file path or a BGR NumPy array (e.g. a camera frame), applies the Section 4.6 pipeline, and returns the predicted label, its confidence, and a copy of the input image annotated with the result. This keeps the training pipeline (tf.data, Section 3–4) and the single-image demo pipeline (OpenCV) using the same trained model and the same class order, so predictions from either path are directly comparable (see Section 4.2 for the one implementation difference between them). The full implementation, including this notebook, the live demo, and the trained model, is published in the project's GitHub repository (https://github.com/J4ve/cv-object-sorting).</w:t>
       </w:r>
     </w:p>
     <w:p>
@@ -7997,7 +8024,7 @@
         <w:rPr>
           <w:rtl w:val="0"/>
         </w:rPr>
-        <w:t xml:space="preserve">Each recognized image is annotated with: a colored border (green if confident, orange if below the 0.60 threshold) drawn with cv2.rectangle, and a text banner in the top-left corner showing the predicted class label and confidence percentage, drawn with cv2.putText. The full per-class softmax probabilities are also printed below the image.</w:t>
+        <w:t>Each recognized image is annotated with: a colored border (green if confident, orange if below the predicted class's own threshold, Table 5) drawn with cv2.rectangle, and a text banner in the top-left corner showing the predicted class label and confidence percentage, drawn with cv2.putText. The full per-class softmax probabilities are also printed below the image.</w:t>
       </w:r>
     </w:p>
     <w:p>
@@ -10546,7 +10573,7 @@
       <w:pPr>
         <w:spacing w:after="160" w:line="240" w:lineRule="auto"/>
         <w:ind w:left="1440" w:hanging="720"/>
-        <w:jc w:val="both"/>
+        <w:jc w:val="left"/>
         <w:rPr/>
       </w:pPr>
       <w:r>

</xml_diff>